<commit_message>
Bump A051 checklist row sizing for readability
Description text 9pt → 10pt, item-number bold + 10pt, checkbox
glyph 11pt → 14pt, cell padding 80 → 100 twips top/bottom and
120 left/right. Header row matches. If the 33 items spill onto
a follow-on page, that's preferable to cramming them at
small-print sizes.
</commit_message>
<xml_diff>
--- a/assets/bs5839-commissioning-cert-template.docx
+++ b/assets/bs5839-commissioning-cert-template.docx
@@ -1918,10 +1918,10 @@
             <w:tcW w:type="dxa" w:w="510"/>
             <w:shd w:val="clear" w:color="auto" w:fill="1F2937"/>
             <w:tcMar>
-              <w:top w:w="80" w:type="dxa"/>
-              <w:bottom w:w="80" w:type="dxa"/>
-              <w:left w:w="80" w:type="dxa"/>
-              <w:right w:w="80" w:type="dxa"/>
+              <w:top w:w="100" w:type="dxa"/>
+              <w:bottom w:w="100" w:type="dxa"/>
+              <w:left w:w="120" w:type="dxa"/>
+              <w:right w:w="120" w:type="dxa"/>
             </w:tcMar>
           </w:tcPr>
           <w:p>
@@ -1933,7 +1933,7 @@
                 <w:rFonts w:ascii="Calibri" w:hAnsi="Calibri"/>
                 <w:b/>
                 <w:color w:val="FFFFFF"/>
-                <w:sz w:val="18"/>
+                <w:sz w:val="20"/>
               </w:rPr>
               <w:t>Item</w:t>
             </w:r>
@@ -1944,10 +1944,10 @@
             <w:tcW w:type="dxa" w:w="7483"/>
             <w:shd w:val="clear" w:color="auto" w:fill="1F2937"/>
             <w:tcMar>
-              <w:top w:w="80" w:type="dxa"/>
-              <w:bottom w:w="80" w:type="dxa"/>
-              <w:left w:w="80" w:type="dxa"/>
-              <w:right w:w="80" w:type="dxa"/>
+              <w:top w:w="100" w:type="dxa"/>
+              <w:bottom w:w="100" w:type="dxa"/>
+              <w:left w:w="120" w:type="dxa"/>
+              <w:right w:w="120" w:type="dxa"/>
             </w:tcMar>
           </w:tcPr>
           <w:p>
@@ -1959,7 +1959,7 @@
                 <w:rFonts w:ascii="Calibri" w:hAnsi="Calibri"/>
                 <w:b/>
                 <w:color w:val="FFFFFF"/>
-                <w:sz w:val="18"/>
+                <w:sz w:val="20"/>
               </w:rPr>
               <w:t>Description</w:t>
             </w:r>
@@ -1970,10 +1970,10 @@
             <w:tcW w:type="dxa" w:w="567"/>
             <w:shd w:val="clear" w:color="auto" w:fill="1F2937"/>
             <w:tcMar>
-              <w:top w:w="80" w:type="dxa"/>
-              <w:bottom w:w="80" w:type="dxa"/>
-              <w:left w:w="80" w:type="dxa"/>
-              <w:right w:w="80" w:type="dxa"/>
+              <w:top w:w="100" w:type="dxa"/>
+              <w:bottom w:w="100" w:type="dxa"/>
+              <w:left w:w="120" w:type="dxa"/>
+              <w:right w:w="120" w:type="dxa"/>
             </w:tcMar>
           </w:tcPr>
           <w:p>
@@ -1985,7 +1985,7 @@
                 <w:rFonts w:ascii="Calibri" w:hAnsi="Calibri"/>
                 <w:b/>
                 <w:color w:val="FFFFFF"/>
-                <w:sz w:val="18"/>
+                <w:sz w:val="20"/>
               </w:rPr>
               <w:t>Y</w:t>
             </w:r>
@@ -1996,10 +1996,10 @@
             <w:tcW w:type="dxa" w:w="567"/>
             <w:shd w:val="clear" w:color="auto" w:fill="1F2937"/>
             <w:tcMar>
-              <w:top w:w="80" w:type="dxa"/>
-              <w:bottom w:w="80" w:type="dxa"/>
-              <w:left w:w="80" w:type="dxa"/>
-              <w:right w:w="80" w:type="dxa"/>
+              <w:top w:w="100" w:type="dxa"/>
+              <w:bottom w:w="100" w:type="dxa"/>
+              <w:left w:w="120" w:type="dxa"/>
+              <w:right w:w="120" w:type="dxa"/>
             </w:tcMar>
           </w:tcPr>
           <w:p>
@@ -2011,7 +2011,7 @@
                 <w:rFonts w:ascii="Calibri" w:hAnsi="Calibri"/>
                 <w:b/>
                 <w:color w:val="FFFFFF"/>
-                <w:sz w:val="18"/>
+                <w:sz w:val="20"/>
               </w:rPr>
               <w:t>N</w:t>
             </w:r>
@@ -2022,10 +2022,10 @@
             <w:tcW w:type="dxa" w:w="680"/>
             <w:shd w:val="clear" w:color="auto" w:fill="1F2937"/>
             <w:tcMar>
-              <w:top w:w="80" w:type="dxa"/>
-              <w:bottom w:w="80" w:type="dxa"/>
-              <w:left w:w="80" w:type="dxa"/>
-              <w:right w:w="80" w:type="dxa"/>
+              <w:top w:w="100" w:type="dxa"/>
+              <w:bottom w:w="100" w:type="dxa"/>
+              <w:left w:w="120" w:type="dxa"/>
+              <w:right w:w="120" w:type="dxa"/>
             </w:tcMar>
           </w:tcPr>
           <w:p>
@@ -2037,7 +2037,7 @@
                 <w:rFonts w:ascii="Calibri" w:hAnsi="Calibri"/>
                 <w:b/>
                 <w:color w:val="FFFFFF"/>
-                <w:sz w:val="18"/>
+                <w:sz w:val="20"/>
               </w:rPr>
               <w:t>N/A</w:t>
             </w:r>
@@ -2048,6 +2048,12 @@
         <w:tc>
           <w:tcPr>
             <w:tcW w:type="dxa" w:w="510"/>
+            <w:tcMar>
+              <w:top w:w="100" w:type="dxa"/>
+              <w:bottom w:w="100" w:type="dxa"/>
+              <w:left w:w="120" w:type="dxa"/>
+              <w:right w:w="120" w:type="dxa"/>
+            </w:tcMar>
           </w:tcPr>
           <w:p>
             <w:pPr>
@@ -2056,7 +2062,8 @@
             <w:r>
               <w:rPr>
                 <w:rFonts w:ascii="Calibri" w:hAnsi="Calibri"/>
-                <w:sz w:val="18"/>
+                <w:b/>
+                <w:sz w:val="20"/>
               </w:rPr>
               <w:t>1</w:t>
             </w:r>
@@ -2065,13 +2072,19 @@
         <w:tc>
           <w:tcPr>
             <w:tcW w:type="dxa" w:w="7483"/>
+            <w:tcMar>
+              <w:top w:w="100" w:type="dxa"/>
+              <w:bottom w:w="100" w:type="dxa"/>
+              <w:left w:w="120" w:type="dxa"/>
+              <w:right w:w="120" w:type="dxa"/>
+            </w:tcMar>
           </w:tcPr>
           <w:p>
             <w:r>
               <w:rPr>
                 <w:rFonts w:ascii="Calibri" w:hAnsi="Calibri"/>
                 <w:color w:val="1A1F2C"/>
-                <w:sz w:val="18"/>
+                <w:sz w:val="20"/>
               </w:rPr>
               <w:t>The system complies with the original specification / design and the use of the building has not changed.</w:t>
             </w:r>
@@ -2080,6 +2093,12 @@
         <w:tc>
           <w:tcPr>
             <w:tcW w:type="dxa" w:w="567"/>
+            <w:tcMar>
+              <w:top w:w="100" w:type="dxa"/>
+              <w:bottom w:w="100" w:type="dxa"/>
+              <w:left w:w="120" w:type="dxa"/>
+              <w:right w:w="120" w:type="dxa"/>
+            </w:tcMar>
           </w:tcPr>
           <w:p>
             <w:pPr>
@@ -2088,7 +2107,7 @@
             <w:r>
               <w:rPr>
                 <w:rFonts w:ascii="Calibri" w:hAnsi="Calibri"/>
-                <w:sz w:val="22"/>
+                <w:sz w:val="28"/>
               </w:rPr>
               <w:t>☐</w:t>
             </w:r>
@@ -2097,6 +2116,12 @@
         <w:tc>
           <w:tcPr>
             <w:tcW w:type="dxa" w:w="567"/>
+            <w:tcMar>
+              <w:top w:w="100" w:type="dxa"/>
+              <w:bottom w:w="100" w:type="dxa"/>
+              <w:left w:w="120" w:type="dxa"/>
+              <w:right w:w="120" w:type="dxa"/>
+            </w:tcMar>
           </w:tcPr>
           <w:p>
             <w:pPr>
@@ -2105,7 +2130,7 @@
             <w:r>
               <w:rPr>
                 <w:rFonts w:ascii="Calibri" w:hAnsi="Calibri"/>
-                <w:sz w:val="22"/>
+                <w:sz w:val="28"/>
               </w:rPr>
               <w:t>☐</w:t>
             </w:r>
@@ -2114,6 +2139,12 @@
         <w:tc>
           <w:tcPr>
             <w:tcW w:type="dxa" w:w="680"/>
+            <w:tcMar>
+              <w:top w:w="100" w:type="dxa"/>
+              <w:bottom w:w="100" w:type="dxa"/>
+              <w:left w:w="120" w:type="dxa"/>
+              <w:right w:w="120" w:type="dxa"/>
+            </w:tcMar>
           </w:tcPr>
           <w:p>
             <w:pPr>
@@ -2122,7 +2153,7 @@
             <w:r>
               <w:rPr>
                 <w:rFonts w:ascii="Calibri" w:hAnsi="Calibri"/>
-                <w:sz w:val="22"/>
+                <w:sz w:val="28"/>
               </w:rPr>
               <w:t>☐</w:t>
             </w:r>
@@ -2133,6 +2164,12 @@
         <w:tc>
           <w:tcPr>
             <w:tcW w:type="dxa" w:w="510"/>
+            <w:tcMar>
+              <w:top w:w="100" w:type="dxa"/>
+              <w:bottom w:w="100" w:type="dxa"/>
+              <w:left w:w="120" w:type="dxa"/>
+              <w:right w:w="120" w:type="dxa"/>
+            </w:tcMar>
           </w:tcPr>
           <w:p>
             <w:pPr>
@@ -2141,7 +2178,8 @@
             <w:r>
               <w:rPr>
                 <w:rFonts w:ascii="Calibri" w:hAnsi="Calibri"/>
-                <w:sz w:val="18"/>
+                <w:b/>
+                <w:sz w:val="20"/>
               </w:rPr>
               <w:t>2</w:t>
             </w:r>
@@ -2150,13 +2188,19 @@
         <w:tc>
           <w:tcPr>
             <w:tcW w:type="dxa" w:w="7483"/>
+            <w:tcMar>
+              <w:top w:w="100" w:type="dxa"/>
+              <w:bottom w:w="100" w:type="dxa"/>
+              <w:left w:w="120" w:type="dxa"/>
+              <w:right w:w="120" w:type="dxa"/>
+            </w:tcMar>
           </w:tcPr>
           <w:p>
             <w:r>
               <w:rPr>
                 <w:rFonts w:ascii="Calibri" w:hAnsi="Calibri"/>
                 <w:color w:val="1A1F2C"/>
-                <w:sz w:val="18"/>
+                <w:sz w:val="20"/>
               </w:rPr>
               <w:t>The 'as fitted' drawing accurately reflects the building structure (any changes recorded and passed to PM).</w:t>
             </w:r>
@@ -2165,6 +2209,12 @@
         <w:tc>
           <w:tcPr>
             <w:tcW w:type="dxa" w:w="567"/>
+            <w:tcMar>
+              <w:top w:w="100" w:type="dxa"/>
+              <w:bottom w:w="100" w:type="dxa"/>
+              <w:left w:w="120" w:type="dxa"/>
+              <w:right w:w="120" w:type="dxa"/>
+            </w:tcMar>
           </w:tcPr>
           <w:p>
             <w:pPr>
@@ -2173,7 +2223,7 @@
             <w:r>
               <w:rPr>
                 <w:rFonts w:ascii="Calibri" w:hAnsi="Calibri"/>
-                <w:sz w:val="22"/>
+                <w:sz w:val="28"/>
               </w:rPr>
               <w:t>☐</w:t>
             </w:r>
@@ -2182,6 +2232,12 @@
         <w:tc>
           <w:tcPr>
             <w:tcW w:type="dxa" w:w="567"/>
+            <w:tcMar>
+              <w:top w:w="100" w:type="dxa"/>
+              <w:bottom w:w="100" w:type="dxa"/>
+              <w:left w:w="120" w:type="dxa"/>
+              <w:right w:w="120" w:type="dxa"/>
+            </w:tcMar>
           </w:tcPr>
           <w:p>
             <w:pPr>
@@ -2190,7 +2246,7 @@
             <w:r>
               <w:rPr>
                 <w:rFonts w:ascii="Calibri" w:hAnsi="Calibri"/>
-                <w:sz w:val="22"/>
+                <w:sz w:val="28"/>
               </w:rPr>
               <w:t>☐</w:t>
             </w:r>
@@ -2199,6 +2255,12 @@
         <w:tc>
           <w:tcPr>
             <w:tcW w:type="dxa" w:w="680"/>
+            <w:tcMar>
+              <w:top w:w="100" w:type="dxa"/>
+              <w:bottom w:w="100" w:type="dxa"/>
+              <w:left w:w="120" w:type="dxa"/>
+              <w:right w:w="120" w:type="dxa"/>
+            </w:tcMar>
           </w:tcPr>
           <w:p>
             <w:pPr>
@@ -2207,7 +2269,7 @@
             <w:r>
               <w:rPr>
                 <w:rFonts w:ascii="Calibri" w:hAnsi="Calibri"/>
-                <w:sz w:val="22"/>
+                <w:sz w:val="28"/>
               </w:rPr>
               <w:t>☐</w:t>
             </w:r>
@@ -2218,6 +2280,12 @@
         <w:tc>
           <w:tcPr>
             <w:tcW w:type="dxa" w:w="510"/>
+            <w:tcMar>
+              <w:top w:w="100" w:type="dxa"/>
+              <w:bottom w:w="100" w:type="dxa"/>
+              <w:left w:w="120" w:type="dxa"/>
+              <w:right w:w="120" w:type="dxa"/>
+            </w:tcMar>
           </w:tcPr>
           <w:p>
             <w:pPr>
@@ -2226,7 +2294,8 @@
             <w:r>
               <w:rPr>
                 <w:rFonts w:ascii="Calibri" w:hAnsi="Calibri"/>
-                <w:sz w:val="18"/>
+                <w:b/>
+                <w:sz w:val="20"/>
               </w:rPr>
               <w:t>3</w:t>
             </w:r>
@@ -2235,13 +2304,19 @@
         <w:tc>
           <w:tcPr>
             <w:tcW w:type="dxa" w:w="7483"/>
+            <w:tcMar>
+              <w:top w:w="100" w:type="dxa"/>
+              <w:bottom w:w="100" w:type="dxa"/>
+              <w:left w:w="120" w:type="dxa"/>
+              <w:right w:w="120" w:type="dxa"/>
+            </w:tcMar>
           </w:tcPr>
           <w:p>
             <w:r>
               <w:rPr>
                 <w:rFonts w:ascii="Calibri" w:hAnsi="Calibri"/>
                 <w:color w:val="1A1F2C"/>
-                <w:sz w:val="18"/>
+                <w:sz w:val="20"/>
               </w:rPr>
               <w:t>System has been installed to meet the requirements of category L1 / L2 / L3 / L4 / L5 / P1 / P2 / M (state).</w:t>
             </w:r>
@@ -2250,6 +2325,12 @@
         <w:tc>
           <w:tcPr>
             <w:tcW w:type="dxa" w:w="567"/>
+            <w:tcMar>
+              <w:top w:w="100" w:type="dxa"/>
+              <w:bottom w:w="100" w:type="dxa"/>
+              <w:left w:w="120" w:type="dxa"/>
+              <w:right w:w="120" w:type="dxa"/>
+            </w:tcMar>
           </w:tcPr>
           <w:p>
             <w:pPr>
@@ -2258,7 +2339,7 @@
             <w:r>
               <w:rPr>
                 <w:rFonts w:ascii="Calibri" w:hAnsi="Calibri"/>
-                <w:sz w:val="22"/>
+                <w:sz w:val="28"/>
               </w:rPr>
               <w:t>☐</w:t>
             </w:r>
@@ -2267,6 +2348,12 @@
         <w:tc>
           <w:tcPr>
             <w:tcW w:type="dxa" w:w="567"/>
+            <w:tcMar>
+              <w:top w:w="100" w:type="dxa"/>
+              <w:bottom w:w="100" w:type="dxa"/>
+              <w:left w:w="120" w:type="dxa"/>
+              <w:right w:w="120" w:type="dxa"/>
+            </w:tcMar>
           </w:tcPr>
           <w:p>
             <w:pPr>
@@ -2275,7 +2362,7 @@
             <w:r>
               <w:rPr>
                 <w:rFonts w:ascii="Calibri" w:hAnsi="Calibri"/>
-                <w:sz w:val="22"/>
+                <w:sz w:val="28"/>
               </w:rPr>
               <w:t>☐</w:t>
             </w:r>
@@ -2284,6 +2371,12 @@
         <w:tc>
           <w:tcPr>
             <w:tcW w:type="dxa" w:w="680"/>
+            <w:tcMar>
+              <w:top w:w="100" w:type="dxa"/>
+              <w:bottom w:w="100" w:type="dxa"/>
+              <w:left w:w="120" w:type="dxa"/>
+              <w:right w:w="120" w:type="dxa"/>
+            </w:tcMar>
           </w:tcPr>
           <w:p>
             <w:pPr>
@@ -2292,7 +2385,7 @@
             <w:r>
               <w:rPr>
                 <w:rFonts w:ascii="Calibri" w:hAnsi="Calibri"/>
-                <w:sz w:val="22"/>
+                <w:sz w:val="28"/>
               </w:rPr>
               <w:t>☐</w:t>
             </w:r>
@@ -2303,6 +2396,12 @@
         <w:tc>
           <w:tcPr>
             <w:tcW w:type="dxa" w:w="510"/>
+            <w:tcMar>
+              <w:top w:w="100" w:type="dxa"/>
+              <w:bottom w:w="100" w:type="dxa"/>
+              <w:left w:w="120" w:type="dxa"/>
+              <w:right w:w="120" w:type="dxa"/>
+            </w:tcMar>
           </w:tcPr>
           <w:p>
             <w:pPr>
@@ -2311,7 +2410,8 @@
             <w:r>
               <w:rPr>
                 <w:rFonts w:ascii="Calibri" w:hAnsi="Calibri"/>
-                <w:sz w:val="18"/>
+                <w:b/>
+                <w:sz w:val="20"/>
               </w:rPr>
               <w:t>4</w:t>
             </w:r>
@@ -2320,13 +2420,19 @@
         <w:tc>
           <w:tcPr>
             <w:tcW w:type="dxa" w:w="7483"/>
+            <w:tcMar>
+              <w:top w:w="100" w:type="dxa"/>
+              <w:bottom w:w="100" w:type="dxa"/>
+              <w:left w:w="120" w:type="dxa"/>
+              <w:right w:w="120" w:type="dxa"/>
+            </w:tcMar>
           </w:tcPr>
           <w:p>
             <w:r>
               <w:rPr>
                 <w:rFonts w:ascii="Calibri" w:hAnsi="Calibri"/>
                 <w:color w:val="1A1F2C"/>
-                <w:sz w:val="18"/>
+                <w:sz w:val="20"/>
               </w:rPr>
               <w:t>Variations to the defined category have been identified and the schedule of variations agreed by the client and a nominated designer.</w:t>
             </w:r>
@@ -2335,6 +2441,12 @@
         <w:tc>
           <w:tcPr>
             <w:tcW w:type="dxa" w:w="567"/>
+            <w:tcMar>
+              <w:top w:w="100" w:type="dxa"/>
+              <w:bottom w:w="100" w:type="dxa"/>
+              <w:left w:w="120" w:type="dxa"/>
+              <w:right w:w="120" w:type="dxa"/>
+            </w:tcMar>
           </w:tcPr>
           <w:p>
             <w:pPr>
@@ -2343,7 +2455,7 @@
             <w:r>
               <w:rPr>
                 <w:rFonts w:ascii="Calibri" w:hAnsi="Calibri"/>
-                <w:sz w:val="22"/>
+                <w:sz w:val="28"/>
               </w:rPr>
               <w:t>☐</w:t>
             </w:r>
@@ -2352,6 +2464,12 @@
         <w:tc>
           <w:tcPr>
             <w:tcW w:type="dxa" w:w="567"/>
+            <w:tcMar>
+              <w:top w:w="100" w:type="dxa"/>
+              <w:bottom w:w="100" w:type="dxa"/>
+              <w:left w:w="120" w:type="dxa"/>
+              <w:right w:w="120" w:type="dxa"/>
+            </w:tcMar>
           </w:tcPr>
           <w:p>
             <w:pPr>
@@ -2360,7 +2478,7 @@
             <w:r>
               <w:rPr>
                 <w:rFonts w:ascii="Calibri" w:hAnsi="Calibri"/>
-                <w:sz w:val="22"/>
+                <w:sz w:val="28"/>
               </w:rPr>
               <w:t>☐</w:t>
             </w:r>
@@ -2369,6 +2487,12 @@
         <w:tc>
           <w:tcPr>
             <w:tcW w:type="dxa" w:w="680"/>
+            <w:tcMar>
+              <w:top w:w="100" w:type="dxa"/>
+              <w:bottom w:w="100" w:type="dxa"/>
+              <w:left w:w="120" w:type="dxa"/>
+              <w:right w:w="120" w:type="dxa"/>
+            </w:tcMar>
           </w:tcPr>
           <w:p>
             <w:pPr>
@@ -2377,7 +2501,7 @@
             <w:r>
               <w:rPr>
                 <w:rFonts w:ascii="Calibri" w:hAnsi="Calibri"/>
-                <w:sz w:val="22"/>
+                <w:sz w:val="28"/>
               </w:rPr>
               <w:t>☐</w:t>
             </w:r>
@@ -2388,6 +2512,12 @@
         <w:tc>
           <w:tcPr>
             <w:tcW w:type="dxa" w:w="510"/>
+            <w:tcMar>
+              <w:top w:w="100" w:type="dxa"/>
+              <w:bottom w:w="100" w:type="dxa"/>
+              <w:left w:w="120" w:type="dxa"/>
+              <w:right w:w="120" w:type="dxa"/>
+            </w:tcMar>
           </w:tcPr>
           <w:p>
             <w:pPr>
@@ -2396,7 +2526,8 @@
             <w:r>
               <w:rPr>
                 <w:rFonts w:ascii="Calibri" w:hAnsi="Calibri"/>
-                <w:sz w:val="18"/>
+                <w:b/>
+                <w:sz w:val="20"/>
               </w:rPr>
               <w:t>5</w:t>
             </w:r>
@@ -2405,13 +2536,19 @@
         <w:tc>
           <w:tcPr>
             <w:tcW w:type="dxa" w:w="7483"/>
+            <w:tcMar>
+              <w:top w:w="100" w:type="dxa"/>
+              <w:bottom w:w="100" w:type="dxa"/>
+              <w:left w:w="120" w:type="dxa"/>
+              <w:right w:w="120" w:type="dxa"/>
+            </w:tcMar>
           </w:tcPr>
           <w:p>
             <w:r>
               <w:rPr>
                 <w:rFonts w:ascii="Calibri" w:hAnsi="Calibri"/>
                 <w:color w:val="1A1F2C"/>
-                <w:sz w:val="18"/>
+                <w:sz w:val="20"/>
               </w:rPr>
               <w:t>Cables meet requirements for standard / enhanced / mixed (BS 5839-1 §26.2).</w:t>
             </w:r>
@@ -2420,6 +2557,12 @@
         <w:tc>
           <w:tcPr>
             <w:tcW w:type="dxa" w:w="567"/>
+            <w:tcMar>
+              <w:top w:w="100" w:type="dxa"/>
+              <w:bottom w:w="100" w:type="dxa"/>
+              <w:left w:w="120" w:type="dxa"/>
+              <w:right w:w="120" w:type="dxa"/>
+            </w:tcMar>
           </w:tcPr>
           <w:p>
             <w:pPr>
@@ -2428,7 +2571,7 @@
             <w:r>
               <w:rPr>
                 <w:rFonts w:ascii="Calibri" w:hAnsi="Calibri"/>
-                <w:sz w:val="22"/>
+                <w:sz w:val="28"/>
               </w:rPr>
               <w:t>☐</w:t>
             </w:r>
@@ -2437,6 +2580,12 @@
         <w:tc>
           <w:tcPr>
             <w:tcW w:type="dxa" w:w="567"/>
+            <w:tcMar>
+              <w:top w:w="100" w:type="dxa"/>
+              <w:bottom w:w="100" w:type="dxa"/>
+              <w:left w:w="120" w:type="dxa"/>
+              <w:right w:w="120" w:type="dxa"/>
+            </w:tcMar>
           </w:tcPr>
           <w:p>
             <w:pPr>
@@ -2445,7 +2594,7 @@
             <w:r>
               <w:rPr>
                 <w:rFonts w:ascii="Calibri" w:hAnsi="Calibri"/>
-                <w:sz w:val="22"/>
+                <w:sz w:val="28"/>
               </w:rPr>
               <w:t>☐</w:t>
             </w:r>
@@ -2454,6 +2603,12 @@
         <w:tc>
           <w:tcPr>
             <w:tcW w:type="dxa" w:w="680"/>
+            <w:tcMar>
+              <w:top w:w="100" w:type="dxa"/>
+              <w:bottom w:w="100" w:type="dxa"/>
+              <w:left w:w="120" w:type="dxa"/>
+              <w:right w:w="120" w:type="dxa"/>
+            </w:tcMar>
           </w:tcPr>
           <w:p>
             <w:pPr>
@@ -2462,7 +2617,7 @@
             <w:r>
               <w:rPr>
                 <w:rFonts w:ascii="Calibri" w:hAnsi="Calibri"/>
-                <w:sz w:val="22"/>
+                <w:sz w:val="28"/>
               </w:rPr>
               <w:t>☐</w:t>
             </w:r>
@@ -2473,6 +2628,12 @@
         <w:tc>
           <w:tcPr>
             <w:tcW w:type="dxa" w:w="510"/>
+            <w:tcMar>
+              <w:top w:w="100" w:type="dxa"/>
+              <w:bottom w:w="100" w:type="dxa"/>
+              <w:left w:w="120" w:type="dxa"/>
+              <w:right w:w="120" w:type="dxa"/>
+            </w:tcMar>
           </w:tcPr>
           <w:p>
             <w:pPr>
@@ -2481,7 +2642,8 @@
             <w:r>
               <w:rPr>
                 <w:rFonts w:ascii="Calibri" w:hAnsi="Calibri"/>
-                <w:sz w:val="18"/>
+                <w:b/>
+                <w:sz w:val="20"/>
               </w:rPr>
               <w:t>6</w:t>
             </w:r>
@@ -2490,13 +2652,19 @@
         <w:tc>
           <w:tcPr>
             <w:tcW w:type="dxa" w:w="7483"/>
+            <w:tcMar>
+              <w:top w:w="100" w:type="dxa"/>
+              <w:bottom w:w="100" w:type="dxa"/>
+              <w:left w:w="120" w:type="dxa"/>
+              <w:right w:w="120" w:type="dxa"/>
+            </w:tcMar>
           </w:tcPr>
           <w:p>
             <w:r>
               <w:rPr>
                 <w:rFonts w:ascii="Calibri" w:hAnsi="Calibri"/>
                 <w:color w:val="1A1F2C"/>
-                <w:sz w:val="18"/>
+                <w:sz w:val="20"/>
               </w:rPr>
               <w:t>Cables are segregated as required and suitably supported (where visibly checked, §26.2).</w:t>
             </w:r>
@@ -2505,6 +2673,12 @@
         <w:tc>
           <w:tcPr>
             <w:tcW w:type="dxa" w:w="567"/>
+            <w:tcMar>
+              <w:top w:w="100" w:type="dxa"/>
+              <w:bottom w:w="100" w:type="dxa"/>
+              <w:left w:w="120" w:type="dxa"/>
+              <w:right w:w="120" w:type="dxa"/>
+            </w:tcMar>
           </w:tcPr>
           <w:p>
             <w:pPr>
@@ -2513,7 +2687,7 @@
             <w:r>
               <w:rPr>
                 <w:rFonts w:ascii="Calibri" w:hAnsi="Calibri"/>
-                <w:sz w:val="22"/>
+                <w:sz w:val="28"/>
               </w:rPr>
               <w:t>☐</w:t>
             </w:r>
@@ -2522,6 +2696,12 @@
         <w:tc>
           <w:tcPr>
             <w:tcW w:type="dxa" w:w="567"/>
+            <w:tcMar>
+              <w:top w:w="100" w:type="dxa"/>
+              <w:bottom w:w="100" w:type="dxa"/>
+              <w:left w:w="120" w:type="dxa"/>
+              <w:right w:w="120" w:type="dxa"/>
+            </w:tcMar>
           </w:tcPr>
           <w:p>
             <w:pPr>
@@ -2530,7 +2710,7 @@
             <w:r>
               <w:rPr>
                 <w:rFonts w:ascii="Calibri" w:hAnsi="Calibri"/>
-                <w:sz w:val="22"/>
+                <w:sz w:val="28"/>
               </w:rPr>
               <w:t>☐</w:t>
             </w:r>
@@ -2539,6 +2719,12 @@
         <w:tc>
           <w:tcPr>
             <w:tcW w:type="dxa" w:w="680"/>
+            <w:tcMar>
+              <w:top w:w="100" w:type="dxa"/>
+              <w:bottom w:w="100" w:type="dxa"/>
+              <w:left w:w="120" w:type="dxa"/>
+              <w:right w:w="120" w:type="dxa"/>
+            </w:tcMar>
           </w:tcPr>
           <w:p>
             <w:pPr>
@@ -2547,7 +2733,7 @@
             <w:r>
               <w:rPr>
                 <w:rFonts w:ascii="Calibri" w:hAnsi="Calibri"/>
-                <w:sz w:val="22"/>
+                <w:sz w:val="28"/>
               </w:rPr>
               <w:t>☐</w:t>
             </w:r>
@@ -2558,6 +2744,12 @@
         <w:tc>
           <w:tcPr>
             <w:tcW w:type="dxa" w:w="510"/>
+            <w:tcMar>
+              <w:top w:w="100" w:type="dxa"/>
+              <w:bottom w:w="100" w:type="dxa"/>
+              <w:left w:w="120" w:type="dxa"/>
+              <w:right w:w="120" w:type="dxa"/>
+            </w:tcMar>
           </w:tcPr>
           <w:p>
             <w:pPr>
@@ -2566,7 +2758,8 @@
             <w:r>
               <w:rPr>
                 <w:rFonts w:ascii="Calibri" w:hAnsi="Calibri"/>
-                <w:sz w:val="18"/>
+                <w:b/>
+                <w:sz w:val="20"/>
               </w:rPr>
               <w:t>7</w:t>
             </w:r>
@@ -2575,13 +2768,19 @@
         <w:tc>
           <w:tcPr>
             <w:tcW w:type="dxa" w:w="7483"/>
+            <w:tcMar>
+              <w:top w:w="100" w:type="dxa"/>
+              <w:bottom w:w="100" w:type="dxa"/>
+              <w:left w:w="120" w:type="dxa"/>
+              <w:right w:w="120" w:type="dxa"/>
+            </w:tcMar>
           </w:tcPr>
           <w:p>
             <w:r>
               <w:rPr>
                 <w:rFonts w:ascii="Calibri" w:hAnsi="Calibri"/>
                 <w:color w:val="1A1F2C"/>
-                <w:sz w:val="18"/>
+                <w:sz w:val="20"/>
               </w:rPr>
               <w:t>Cables are mechanically protected as required where necessary (§26.2).</w:t>
             </w:r>
@@ -2590,6 +2789,12 @@
         <w:tc>
           <w:tcPr>
             <w:tcW w:type="dxa" w:w="567"/>
+            <w:tcMar>
+              <w:top w:w="100" w:type="dxa"/>
+              <w:bottom w:w="100" w:type="dxa"/>
+              <w:left w:w="120" w:type="dxa"/>
+              <w:right w:w="120" w:type="dxa"/>
+            </w:tcMar>
           </w:tcPr>
           <w:p>
             <w:pPr>
@@ -2598,7 +2803,7 @@
             <w:r>
               <w:rPr>
                 <w:rFonts w:ascii="Calibri" w:hAnsi="Calibri"/>
-                <w:sz w:val="22"/>
+                <w:sz w:val="28"/>
               </w:rPr>
               <w:t>☐</w:t>
             </w:r>
@@ -2607,6 +2812,12 @@
         <w:tc>
           <w:tcPr>
             <w:tcW w:type="dxa" w:w="567"/>
+            <w:tcMar>
+              <w:top w:w="100" w:type="dxa"/>
+              <w:bottom w:w="100" w:type="dxa"/>
+              <w:left w:w="120" w:type="dxa"/>
+              <w:right w:w="120" w:type="dxa"/>
+            </w:tcMar>
           </w:tcPr>
           <w:p>
             <w:pPr>
@@ -2615,7 +2826,7 @@
             <w:r>
               <w:rPr>
                 <w:rFonts w:ascii="Calibri" w:hAnsi="Calibri"/>
-                <w:sz w:val="22"/>
+                <w:sz w:val="28"/>
               </w:rPr>
               <w:t>☐</w:t>
             </w:r>
@@ -2624,6 +2835,12 @@
         <w:tc>
           <w:tcPr>
             <w:tcW w:type="dxa" w:w="680"/>
+            <w:tcMar>
+              <w:top w:w="100" w:type="dxa"/>
+              <w:bottom w:w="100" w:type="dxa"/>
+              <w:left w:w="120" w:type="dxa"/>
+              <w:right w:w="120" w:type="dxa"/>
+            </w:tcMar>
           </w:tcPr>
           <w:p>
             <w:pPr>
@@ -2632,7 +2849,7 @@
             <w:r>
               <w:rPr>
                 <w:rFonts w:ascii="Calibri" w:hAnsi="Calibri"/>
-                <w:sz w:val="22"/>
+                <w:sz w:val="28"/>
               </w:rPr>
               <w:t>☐</w:t>
             </w:r>
@@ -2643,6 +2860,12 @@
         <w:tc>
           <w:tcPr>
             <w:tcW w:type="dxa" w:w="510"/>
+            <w:tcMar>
+              <w:top w:w="100" w:type="dxa"/>
+              <w:bottom w:w="100" w:type="dxa"/>
+              <w:left w:w="120" w:type="dxa"/>
+              <w:right w:w="120" w:type="dxa"/>
+            </w:tcMar>
           </w:tcPr>
           <w:p>
             <w:pPr>
@@ -2651,7 +2874,8 @@
             <w:r>
               <w:rPr>
                 <w:rFonts w:ascii="Calibri" w:hAnsi="Calibri"/>
-                <w:sz w:val="18"/>
+                <w:b/>
+                <w:sz w:val="20"/>
               </w:rPr>
               <w:t>8</w:t>
             </w:r>
@@ -2660,13 +2884,19 @@
         <w:tc>
           <w:tcPr>
             <w:tcW w:type="dxa" w:w="7483"/>
+            <w:tcMar>
+              <w:top w:w="100" w:type="dxa"/>
+              <w:bottom w:w="100" w:type="dxa"/>
+              <w:left w:w="120" w:type="dxa"/>
+              <w:right w:w="120" w:type="dxa"/>
+            </w:tcMar>
           </w:tcPr>
           <w:p>
             <w:r>
               <w:rPr>
                 <w:rFonts w:ascii="Calibri" w:hAnsi="Calibri"/>
                 <w:color w:val="1A1F2C"/>
-                <w:sz w:val="18"/>
+                <w:sz w:val="20"/>
               </w:rPr>
               <w:t>Junction boxes correctly labelled and identified on drawings (where visibly checked).</w:t>
             </w:r>
@@ -2675,6 +2905,12 @@
         <w:tc>
           <w:tcPr>
             <w:tcW w:type="dxa" w:w="567"/>
+            <w:tcMar>
+              <w:top w:w="100" w:type="dxa"/>
+              <w:bottom w:w="100" w:type="dxa"/>
+              <w:left w:w="120" w:type="dxa"/>
+              <w:right w:w="120" w:type="dxa"/>
+            </w:tcMar>
           </w:tcPr>
           <w:p>
             <w:pPr>
@@ -2683,7 +2919,7 @@
             <w:r>
               <w:rPr>
                 <w:rFonts w:ascii="Calibri" w:hAnsi="Calibri"/>
-                <w:sz w:val="22"/>
+                <w:sz w:val="28"/>
               </w:rPr>
               <w:t>☐</w:t>
             </w:r>
@@ -2692,6 +2928,12 @@
         <w:tc>
           <w:tcPr>
             <w:tcW w:type="dxa" w:w="567"/>
+            <w:tcMar>
+              <w:top w:w="100" w:type="dxa"/>
+              <w:bottom w:w="100" w:type="dxa"/>
+              <w:left w:w="120" w:type="dxa"/>
+              <w:right w:w="120" w:type="dxa"/>
+            </w:tcMar>
           </w:tcPr>
           <w:p>
             <w:pPr>
@@ -2700,7 +2942,7 @@
             <w:r>
               <w:rPr>
                 <w:rFonts w:ascii="Calibri" w:hAnsi="Calibri"/>
-                <w:sz w:val="22"/>
+                <w:sz w:val="28"/>
               </w:rPr>
               <w:t>☐</w:t>
             </w:r>
@@ -2709,6 +2951,12 @@
         <w:tc>
           <w:tcPr>
             <w:tcW w:type="dxa" w:w="680"/>
+            <w:tcMar>
+              <w:top w:w="100" w:type="dxa"/>
+              <w:bottom w:w="100" w:type="dxa"/>
+              <w:left w:w="120" w:type="dxa"/>
+              <w:right w:w="120" w:type="dxa"/>
+            </w:tcMar>
           </w:tcPr>
           <w:p>
             <w:pPr>
@@ -2717,7 +2965,7 @@
             <w:r>
               <w:rPr>
                 <w:rFonts w:ascii="Calibri" w:hAnsi="Calibri"/>
-                <w:sz w:val="22"/>
+                <w:sz w:val="28"/>
               </w:rPr>
               <w:t>☐</w:t>
             </w:r>
@@ -2728,6 +2976,12 @@
         <w:tc>
           <w:tcPr>
             <w:tcW w:type="dxa" w:w="510"/>
+            <w:tcMar>
+              <w:top w:w="100" w:type="dxa"/>
+              <w:bottom w:w="100" w:type="dxa"/>
+              <w:left w:w="120" w:type="dxa"/>
+              <w:right w:w="120" w:type="dxa"/>
+            </w:tcMar>
           </w:tcPr>
           <w:p>
             <w:pPr>
@@ -2736,7 +2990,8 @@
             <w:r>
               <w:rPr>
                 <w:rFonts w:ascii="Calibri" w:hAnsi="Calibri"/>
-                <w:sz w:val="18"/>
+                <w:b/>
+                <w:sz w:val="20"/>
               </w:rPr>
               <w:t>9</w:t>
             </w:r>
@@ -2745,13 +3000,19 @@
         <w:tc>
           <w:tcPr>
             <w:tcW w:type="dxa" w:w="7483"/>
+            <w:tcMar>
+              <w:top w:w="100" w:type="dxa"/>
+              <w:bottom w:w="100" w:type="dxa"/>
+              <w:left w:w="120" w:type="dxa"/>
+              <w:right w:w="120" w:type="dxa"/>
+            </w:tcMar>
           </w:tcPr>
           <w:p>
             <w:r>
               <w:rPr>
                 <w:rFonts w:ascii="Calibri" w:hAnsi="Calibri"/>
                 <w:color w:val="1A1F2C"/>
-                <w:sz w:val="18"/>
+                <w:sz w:val="20"/>
               </w:rPr>
               <w:t>All cable insulation and continuity resistance measurements are logged.</w:t>
             </w:r>
@@ -2760,6 +3021,12 @@
         <w:tc>
           <w:tcPr>
             <w:tcW w:type="dxa" w:w="567"/>
+            <w:tcMar>
+              <w:top w:w="100" w:type="dxa"/>
+              <w:bottom w:w="100" w:type="dxa"/>
+              <w:left w:w="120" w:type="dxa"/>
+              <w:right w:w="120" w:type="dxa"/>
+            </w:tcMar>
           </w:tcPr>
           <w:p>
             <w:pPr>
@@ -2768,7 +3035,7 @@
             <w:r>
               <w:rPr>
                 <w:rFonts w:ascii="Calibri" w:hAnsi="Calibri"/>
-                <w:sz w:val="22"/>
+                <w:sz w:val="28"/>
               </w:rPr>
               <w:t>☐</w:t>
             </w:r>
@@ -2777,6 +3044,12 @@
         <w:tc>
           <w:tcPr>
             <w:tcW w:type="dxa" w:w="567"/>
+            <w:tcMar>
+              <w:top w:w="100" w:type="dxa"/>
+              <w:bottom w:w="100" w:type="dxa"/>
+              <w:left w:w="120" w:type="dxa"/>
+              <w:right w:w="120" w:type="dxa"/>
+            </w:tcMar>
           </w:tcPr>
           <w:p>
             <w:pPr>
@@ -2785,7 +3058,7 @@
             <w:r>
               <w:rPr>
                 <w:rFonts w:ascii="Calibri" w:hAnsi="Calibri"/>
-                <w:sz w:val="22"/>
+                <w:sz w:val="28"/>
               </w:rPr>
               <w:t>☐</w:t>
             </w:r>
@@ -2794,6 +3067,12 @@
         <w:tc>
           <w:tcPr>
             <w:tcW w:type="dxa" w:w="680"/>
+            <w:tcMar>
+              <w:top w:w="100" w:type="dxa"/>
+              <w:bottom w:w="100" w:type="dxa"/>
+              <w:left w:w="120" w:type="dxa"/>
+              <w:right w:w="120" w:type="dxa"/>
+            </w:tcMar>
           </w:tcPr>
           <w:p>
             <w:pPr>
@@ -2802,7 +3081,7 @@
             <w:r>
               <w:rPr>
                 <w:rFonts w:ascii="Calibri" w:hAnsi="Calibri"/>
-                <w:sz w:val="22"/>
+                <w:sz w:val="28"/>
               </w:rPr>
               <w:t>☐</w:t>
             </w:r>
@@ -2813,6 +3092,12 @@
         <w:tc>
           <w:tcPr>
             <w:tcW w:type="dxa" w:w="510"/>
+            <w:tcMar>
+              <w:top w:w="100" w:type="dxa"/>
+              <w:bottom w:w="100" w:type="dxa"/>
+              <w:left w:w="120" w:type="dxa"/>
+              <w:right w:w="120" w:type="dxa"/>
+            </w:tcMar>
           </w:tcPr>
           <w:p>
             <w:pPr>
@@ -2821,7 +3106,8 @@
             <w:r>
               <w:rPr>
                 <w:rFonts w:ascii="Calibri" w:hAnsi="Calibri"/>
-                <w:sz w:val="18"/>
+                <w:b/>
+                <w:sz w:val="20"/>
               </w:rPr>
               <w:t>10</w:t>
             </w:r>
@@ -2830,13 +3116,19 @@
         <w:tc>
           <w:tcPr>
             <w:tcW w:type="dxa" w:w="7483"/>
+            <w:tcMar>
+              <w:top w:w="100" w:type="dxa"/>
+              <w:bottom w:w="100" w:type="dxa"/>
+              <w:left w:w="120" w:type="dxa"/>
+              <w:right w:w="120" w:type="dxa"/>
+            </w:tcMar>
           </w:tcPr>
           <w:p>
             <w:r>
               <w:rPr>
                 <w:rFonts w:ascii="Calibri" w:hAnsi="Calibri"/>
                 <w:color w:val="1A1F2C"/>
-                <w:sz w:val="18"/>
+                <w:sz w:val="20"/>
               </w:rPr>
               <w:t>All cable penetrations are sleeved and fire-stopped (where visibly checked).</w:t>
             </w:r>
@@ -2845,6 +3137,12 @@
         <w:tc>
           <w:tcPr>
             <w:tcW w:type="dxa" w:w="567"/>
+            <w:tcMar>
+              <w:top w:w="100" w:type="dxa"/>
+              <w:bottom w:w="100" w:type="dxa"/>
+              <w:left w:w="120" w:type="dxa"/>
+              <w:right w:w="120" w:type="dxa"/>
+            </w:tcMar>
           </w:tcPr>
           <w:p>
             <w:pPr>
@@ -2853,7 +3151,7 @@
             <w:r>
               <w:rPr>
                 <w:rFonts w:ascii="Calibri" w:hAnsi="Calibri"/>
-                <w:sz w:val="22"/>
+                <w:sz w:val="28"/>
               </w:rPr>
               <w:t>☐</w:t>
             </w:r>
@@ -2862,6 +3160,12 @@
         <w:tc>
           <w:tcPr>
             <w:tcW w:type="dxa" w:w="567"/>
+            <w:tcMar>
+              <w:top w:w="100" w:type="dxa"/>
+              <w:bottom w:w="100" w:type="dxa"/>
+              <w:left w:w="120" w:type="dxa"/>
+              <w:right w:w="120" w:type="dxa"/>
+            </w:tcMar>
           </w:tcPr>
           <w:p>
             <w:pPr>
@@ -2870,7 +3174,7 @@
             <w:r>
               <w:rPr>
                 <w:rFonts w:ascii="Calibri" w:hAnsi="Calibri"/>
-                <w:sz w:val="22"/>
+                <w:sz w:val="28"/>
               </w:rPr>
               <w:t>☐</w:t>
             </w:r>
@@ -2879,6 +3183,12 @@
         <w:tc>
           <w:tcPr>
             <w:tcW w:type="dxa" w:w="680"/>
+            <w:tcMar>
+              <w:top w:w="100" w:type="dxa"/>
+              <w:bottom w:w="100" w:type="dxa"/>
+              <w:left w:w="120" w:type="dxa"/>
+              <w:right w:w="120" w:type="dxa"/>
+            </w:tcMar>
           </w:tcPr>
           <w:p>
             <w:pPr>
@@ -2887,7 +3197,7 @@
             <w:r>
               <w:rPr>
                 <w:rFonts w:ascii="Calibri" w:hAnsi="Calibri"/>
-                <w:sz w:val="22"/>
+                <w:sz w:val="28"/>
               </w:rPr>
               <w:t>☐</w:t>
             </w:r>
@@ -2898,6 +3208,12 @@
         <w:tc>
           <w:tcPr>
             <w:tcW w:type="dxa" w:w="510"/>
+            <w:tcMar>
+              <w:top w:w="100" w:type="dxa"/>
+              <w:bottom w:w="100" w:type="dxa"/>
+              <w:left w:w="120" w:type="dxa"/>
+              <w:right w:w="120" w:type="dxa"/>
+            </w:tcMar>
           </w:tcPr>
           <w:p>
             <w:pPr>
@@ -2906,7 +3222,8 @@
             <w:r>
               <w:rPr>
                 <w:rFonts w:ascii="Calibri" w:hAnsi="Calibri"/>
-                <w:sz w:val="18"/>
+                <w:b/>
+                <w:sz w:val="20"/>
               </w:rPr>
               <w:t>11</w:t>
             </w:r>
@@ -2915,13 +3232,19 @@
         <w:tc>
           <w:tcPr>
             <w:tcW w:type="dxa" w:w="7483"/>
+            <w:tcMar>
+              <w:top w:w="100" w:type="dxa"/>
+              <w:bottom w:w="100" w:type="dxa"/>
+              <w:left w:w="120" w:type="dxa"/>
+              <w:right w:w="120" w:type="dxa"/>
+            </w:tcMar>
           </w:tcPr>
           <w:p>
             <w:r>
               <w:rPr>
                 <w:rFonts w:ascii="Calibri" w:hAnsi="Calibri"/>
                 <w:color w:val="1A1F2C"/>
-                <w:sz w:val="18"/>
+                <w:sz w:val="20"/>
               </w:rPr>
               <w:t>Mains supply is dedicated, key-switched, correctly fused and labelled 'fire alarm — do not switch off' (red, accessible with a special tool only).</w:t>
             </w:r>
@@ -2930,6 +3253,12 @@
         <w:tc>
           <w:tcPr>
             <w:tcW w:type="dxa" w:w="567"/>
+            <w:tcMar>
+              <w:top w:w="100" w:type="dxa"/>
+              <w:bottom w:w="100" w:type="dxa"/>
+              <w:left w:w="120" w:type="dxa"/>
+              <w:right w:w="120" w:type="dxa"/>
+            </w:tcMar>
           </w:tcPr>
           <w:p>
             <w:pPr>
@@ -2938,7 +3267,7 @@
             <w:r>
               <w:rPr>
                 <w:rFonts w:ascii="Calibri" w:hAnsi="Calibri"/>
-                <w:sz w:val="22"/>
+                <w:sz w:val="28"/>
               </w:rPr>
               <w:t>☐</w:t>
             </w:r>
@@ -2947,6 +3276,12 @@
         <w:tc>
           <w:tcPr>
             <w:tcW w:type="dxa" w:w="567"/>
+            <w:tcMar>
+              <w:top w:w="100" w:type="dxa"/>
+              <w:bottom w:w="100" w:type="dxa"/>
+              <w:left w:w="120" w:type="dxa"/>
+              <w:right w:w="120" w:type="dxa"/>
+            </w:tcMar>
           </w:tcPr>
           <w:p>
             <w:pPr>
@@ -2955,7 +3290,7 @@
             <w:r>
               <w:rPr>
                 <w:rFonts w:ascii="Calibri" w:hAnsi="Calibri"/>
-                <w:sz w:val="22"/>
+                <w:sz w:val="28"/>
               </w:rPr>
               <w:t>☐</w:t>
             </w:r>
@@ -2964,6 +3299,12 @@
         <w:tc>
           <w:tcPr>
             <w:tcW w:type="dxa" w:w="680"/>
+            <w:tcMar>
+              <w:top w:w="100" w:type="dxa"/>
+              <w:bottom w:w="100" w:type="dxa"/>
+              <w:left w:w="120" w:type="dxa"/>
+              <w:right w:w="120" w:type="dxa"/>
+            </w:tcMar>
           </w:tcPr>
           <w:p>
             <w:pPr>
@@ -2972,7 +3313,7 @@
             <w:r>
               <w:rPr>
                 <w:rFonts w:ascii="Calibri" w:hAnsi="Calibri"/>
-                <w:sz w:val="22"/>
+                <w:sz w:val="28"/>
               </w:rPr>
               <w:t>☐</w:t>
             </w:r>
@@ -2983,6 +3324,12 @@
         <w:tc>
           <w:tcPr>
             <w:tcW w:type="dxa" w:w="510"/>
+            <w:tcMar>
+              <w:top w:w="100" w:type="dxa"/>
+              <w:bottom w:w="100" w:type="dxa"/>
+              <w:left w:w="120" w:type="dxa"/>
+              <w:right w:w="120" w:type="dxa"/>
+            </w:tcMar>
           </w:tcPr>
           <w:p>
             <w:pPr>
@@ -2991,7 +3338,8 @@
             <w:r>
               <w:rPr>
                 <w:rFonts w:ascii="Calibri" w:hAnsi="Calibri"/>
-                <w:sz w:val="18"/>
+                <w:b/>
+                <w:sz w:val="20"/>
               </w:rPr>
               <w:t>12</w:t>
             </w:r>
@@ -3000,13 +3348,19 @@
         <w:tc>
           <w:tcPr>
             <w:tcW w:type="dxa" w:w="7483"/>
+            <w:tcMar>
+              <w:top w:w="100" w:type="dxa"/>
+              <w:bottom w:w="100" w:type="dxa"/>
+              <w:left w:w="120" w:type="dxa"/>
+              <w:right w:w="120" w:type="dxa"/>
+            </w:tcMar>
           </w:tcPr>
           <w:p>
             <w:r>
               <w:rPr>
                 <w:rFonts w:ascii="Calibri" w:hAnsi="Calibri"/>
                 <w:color w:val="1A1F2C"/>
-                <w:sz w:val="18"/>
+                <w:sz w:val="20"/>
               </w:rPr>
               <w:t>Mains supply identified at ALL distribution boards with a 'fire alarm — do not switch off' label in red.</w:t>
             </w:r>
@@ -3015,6 +3369,12 @@
         <w:tc>
           <w:tcPr>
             <w:tcW w:type="dxa" w:w="567"/>
+            <w:tcMar>
+              <w:top w:w="100" w:type="dxa"/>
+              <w:bottom w:w="100" w:type="dxa"/>
+              <w:left w:w="120" w:type="dxa"/>
+              <w:right w:w="120" w:type="dxa"/>
+            </w:tcMar>
           </w:tcPr>
           <w:p>
             <w:pPr>
@@ -3023,7 +3383,7 @@
             <w:r>
               <w:rPr>
                 <w:rFonts w:ascii="Calibri" w:hAnsi="Calibri"/>
-                <w:sz w:val="22"/>
+                <w:sz w:val="28"/>
               </w:rPr>
               <w:t>☐</w:t>
             </w:r>
@@ -3032,6 +3392,12 @@
         <w:tc>
           <w:tcPr>
             <w:tcW w:type="dxa" w:w="567"/>
+            <w:tcMar>
+              <w:top w:w="100" w:type="dxa"/>
+              <w:bottom w:w="100" w:type="dxa"/>
+              <w:left w:w="120" w:type="dxa"/>
+              <w:right w:w="120" w:type="dxa"/>
+            </w:tcMar>
           </w:tcPr>
           <w:p>
             <w:pPr>
@@ -3040,7 +3406,7 @@
             <w:r>
               <w:rPr>
                 <w:rFonts w:ascii="Calibri" w:hAnsi="Calibri"/>
-                <w:sz w:val="22"/>
+                <w:sz w:val="28"/>
               </w:rPr>
               <w:t>☐</w:t>
             </w:r>
@@ -3049,6 +3415,12 @@
         <w:tc>
           <w:tcPr>
             <w:tcW w:type="dxa" w:w="680"/>
+            <w:tcMar>
+              <w:top w:w="100" w:type="dxa"/>
+              <w:bottom w:w="100" w:type="dxa"/>
+              <w:left w:w="120" w:type="dxa"/>
+              <w:right w:w="120" w:type="dxa"/>
+            </w:tcMar>
           </w:tcPr>
           <w:p>
             <w:pPr>
@@ -3057,7 +3429,7 @@
             <w:r>
               <w:rPr>
                 <w:rFonts w:ascii="Calibri" w:hAnsi="Calibri"/>
-                <w:sz w:val="22"/>
+                <w:sz w:val="28"/>
               </w:rPr>
               <w:t>☐</w:t>
             </w:r>
@@ -3068,6 +3440,12 @@
         <w:tc>
           <w:tcPr>
             <w:tcW w:type="dxa" w:w="510"/>
+            <w:tcMar>
+              <w:top w:w="100" w:type="dxa"/>
+              <w:bottom w:w="100" w:type="dxa"/>
+              <w:left w:w="120" w:type="dxa"/>
+              <w:right w:w="120" w:type="dxa"/>
+            </w:tcMar>
           </w:tcPr>
           <w:p>
             <w:pPr>
@@ -3076,7 +3454,8 @@
             <w:r>
               <w:rPr>
                 <w:rFonts w:ascii="Calibri" w:hAnsi="Calibri"/>
-                <w:sz w:val="18"/>
+                <w:b/>
+                <w:sz w:val="20"/>
               </w:rPr>
               <w:t>13</w:t>
             </w:r>
@@ -3085,13 +3464,19 @@
         <w:tc>
           <w:tcPr>
             <w:tcW w:type="dxa" w:w="7483"/>
+            <w:tcMar>
+              <w:top w:w="100" w:type="dxa"/>
+              <w:bottom w:w="100" w:type="dxa"/>
+              <w:left w:w="120" w:type="dxa"/>
+              <w:right w:w="120" w:type="dxa"/>
+            </w:tcMar>
           </w:tcPr>
           <w:p>
             <w:r>
               <w:rPr>
                 <w:rFonts w:ascii="Calibri" w:hAnsi="Calibri"/>
                 <w:color w:val="1A1F2C"/>
-                <w:sz w:val="18"/>
+                <w:sz w:val="20"/>
               </w:rPr>
               <w:t>230V suppliers' installation covered by a certificate (request the EICR). If not seen, log variation as '230VAC supply test records not seen during commissioning BS 5839-1 §38.2c.'</w:t>
             </w:r>
@@ -3100,6 +3485,12 @@
         <w:tc>
           <w:tcPr>
             <w:tcW w:type="dxa" w:w="567"/>
+            <w:tcMar>
+              <w:top w:w="100" w:type="dxa"/>
+              <w:bottom w:w="100" w:type="dxa"/>
+              <w:left w:w="120" w:type="dxa"/>
+              <w:right w:w="120" w:type="dxa"/>
+            </w:tcMar>
           </w:tcPr>
           <w:p>
             <w:pPr>
@@ -3108,7 +3499,7 @@
             <w:r>
               <w:rPr>
                 <w:rFonts w:ascii="Calibri" w:hAnsi="Calibri"/>
-                <w:sz w:val="22"/>
+                <w:sz w:val="28"/>
               </w:rPr>
               <w:t>☐</w:t>
             </w:r>
@@ -3117,6 +3508,12 @@
         <w:tc>
           <w:tcPr>
             <w:tcW w:type="dxa" w:w="567"/>
+            <w:tcMar>
+              <w:top w:w="100" w:type="dxa"/>
+              <w:bottom w:w="100" w:type="dxa"/>
+              <w:left w:w="120" w:type="dxa"/>
+              <w:right w:w="120" w:type="dxa"/>
+            </w:tcMar>
           </w:tcPr>
           <w:p>
             <w:pPr>
@@ -3125,7 +3522,7 @@
             <w:r>
               <w:rPr>
                 <w:rFonts w:ascii="Calibri" w:hAnsi="Calibri"/>
-                <w:sz w:val="22"/>
+                <w:sz w:val="28"/>
               </w:rPr>
               <w:t>☐</w:t>
             </w:r>
@@ -3134,6 +3531,12 @@
         <w:tc>
           <w:tcPr>
             <w:tcW w:type="dxa" w:w="680"/>
+            <w:tcMar>
+              <w:top w:w="100" w:type="dxa"/>
+              <w:bottom w:w="100" w:type="dxa"/>
+              <w:left w:w="120" w:type="dxa"/>
+              <w:right w:w="120" w:type="dxa"/>
+            </w:tcMar>
           </w:tcPr>
           <w:p>
             <w:pPr>
@@ -3142,7 +3545,7 @@
             <w:r>
               <w:rPr>
                 <w:rFonts w:ascii="Calibri" w:hAnsi="Calibri"/>
-                <w:sz w:val="22"/>
+                <w:sz w:val="28"/>
               </w:rPr>
               <w:t>☐</w:t>
             </w:r>
@@ -3153,6 +3556,12 @@
         <w:tc>
           <w:tcPr>
             <w:tcW w:type="dxa" w:w="510"/>
+            <w:tcMar>
+              <w:top w:w="100" w:type="dxa"/>
+              <w:bottom w:w="100" w:type="dxa"/>
+              <w:left w:w="120" w:type="dxa"/>
+              <w:right w:w="120" w:type="dxa"/>
+            </w:tcMar>
           </w:tcPr>
           <w:p>
             <w:pPr>
@@ -3161,7 +3570,8 @@
             <w:r>
               <w:rPr>
                 <w:rFonts w:ascii="Calibri" w:hAnsi="Calibri"/>
-                <w:sz w:val="18"/>
+                <w:b/>
+                <w:sz w:val="20"/>
               </w:rPr>
               <w:t>14</w:t>
             </w:r>
@@ -3170,13 +3580,19 @@
         <w:tc>
           <w:tcPr>
             <w:tcW w:type="dxa" w:w="7483"/>
+            <w:tcMar>
+              <w:top w:w="100" w:type="dxa"/>
+              <w:bottom w:w="100" w:type="dxa"/>
+              <w:left w:w="120" w:type="dxa"/>
+              <w:right w:w="120" w:type="dxa"/>
+            </w:tcMar>
           </w:tcPr>
           <w:p>
             <w:r>
               <w:rPr>
                 <w:rFonts w:ascii="Calibri" w:hAnsi="Calibri"/>
                 <w:color w:val="1A1F2C"/>
-                <w:sz w:val="18"/>
+                <w:sz w:val="20"/>
               </w:rPr>
               <w:t>Standby battery verification calculation has been carried out for ALL panels / power supplies. If calculation requires larger batteries than provided, contact PM or line manager.</w:t>
             </w:r>
@@ -3185,6 +3601,12 @@
         <w:tc>
           <w:tcPr>
             <w:tcW w:type="dxa" w:w="567"/>
+            <w:tcMar>
+              <w:top w:w="100" w:type="dxa"/>
+              <w:bottom w:w="100" w:type="dxa"/>
+              <w:left w:w="120" w:type="dxa"/>
+              <w:right w:w="120" w:type="dxa"/>
+            </w:tcMar>
           </w:tcPr>
           <w:p>
             <w:pPr>
@@ -3193,7 +3615,7 @@
             <w:r>
               <w:rPr>
                 <w:rFonts w:ascii="Calibri" w:hAnsi="Calibri"/>
-                <w:sz w:val="22"/>
+                <w:sz w:val="28"/>
               </w:rPr>
               <w:t>☐</w:t>
             </w:r>
@@ -3202,6 +3624,12 @@
         <w:tc>
           <w:tcPr>
             <w:tcW w:type="dxa" w:w="567"/>
+            <w:tcMar>
+              <w:top w:w="100" w:type="dxa"/>
+              <w:bottom w:w="100" w:type="dxa"/>
+              <w:left w:w="120" w:type="dxa"/>
+              <w:right w:w="120" w:type="dxa"/>
+            </w:tcMar>
           </w:tcPr>
           <w:p>
             <w:pPr>
@@ -3210,7 +3638,7 @@
             <w:r>
               <w:rPr>
                 <w:rFonts w:ascii="Calibri" w:hAnsi="Calibri"/>
-                <w:sz w:val="22"/>
+                <w:sz w:val="28"/>
               </w:rPr>
               <w:t>☐</w:t>
             </w:r>
@@ -3219,6 +3647,12 @@
         <w:tc>
           <w:tcPr>
             <w:tcW w:type="dxa" w:w="680"/>
+            <w:tcMar>
+              <w:top w:w="100" w:type="dxa"/>
+              <w:bottom w:w="100" w:type="dxa"/>
+              <w:left w:w="120" w:type="dxa"/>
+              <w:right w:w="120" w:type="dxa"/>
+            </w:tcMar>
           </w:tcPr>
           <w:p>
             <w:pPr>
@@ -3227,7 +3661,7 @@
             <w:r>
               <w:rPr>
                 <w:rFonts w:ascii="Calibri" w:hAnsi="Calibri"/>
-                <w:sz w:val="22"/>
+                <w:sz w:val="28"/>
               </w:rPr>
               <w:t>☐</w:t>
             </w:r>
@@ -3238,6 +3672,12 @@
         <w:tc>
           <w:tcPr>
             <w:tcW w:type="dxa" w:w="510"/>
+            <w:tcMar>
+              <w:top w:w="100" w:type="dxa"/>
+              <w:bottom w:w="100" w:type="dxa"/>
+              <w:left w:w="120" w:type="dxa"/>
+              <w:right w:w="120" w:type="dxa"/>
+            </w:tcMar>
           </w:tcPr>
           <w:p>
             <w:pPr>
@@ -3246,7 +3686,8 @@
             <w:r>
               <w:rPr>
                 <w:rFonts w:ascii="Calibri" w:hAnsi="Calibri"/>
-                <w:sz w:val="18"/>
+                <w:b/>
+                <w:sz w:val="20"/>
               </w:rPr>
               <w:t>15</w:t>
             </w:r>
@@ -3255,13 +3696,19 @@
         <w:tc>
           <w:tcPr>
             <w:tcW w:type="dxa" w:w="7483"/>
+            <w:tcMar>
+              <w:top w:w="100" w:type="dxa"/>
+              <w:bottom w:w="100" w:type="dxa"/>
+              <w:left w:w="120" w:type="dxa"/>
+              <w:right w:w="120" w:type="dxa"/>
+            </w:tcMar>
           </w:tcPr>
           <w:p>
             <w:r>
               <w:rPr>
                 <w:rFonts w:ascii="Calibri" w:hAnsi="Calibri"/>
                 <w:color w:val="1A1F2C"/>
-                <w:sz w:val="18"/>
+                <w:sz w:val="20"/>
               </w:rPr>
               <w:t>All batteries are clearly marked and labelled with date of installation (§25.4).</w:t>
             </w:r>
@@ -3270,6 +3717,12 @@
         <w:tc>
           <w:tcPr>
             <w:tcW w:type="dxa" w:w="567"/>
+            <w:tcMar>
+              <w:top w:w="100" w:type="dxa"/>
+              <w:bottom w:w="100" w:type="dxa"/>
+              <w:left w:w="120" w:type="dxa"/>
+              <w:right w:w="120" w:type="dxa"/>
+            </w:tcMar>
           </w:tcPr>
           <w:p>
             <w:pPr>
@@ -3278,7 +3731,7 @@
             <w:r>
               <w:rPr>
                 <w:rFonts w:ascii="Calibri" w:hAnsi="Calibri"/>
-                <w:sz w:val="22"/>
+                <w:sz w:val="28"/>
               </w:rPr>
               <w:t>☐</w:t>
             </w:r>
@@ -3287,6 +3740,12 @@
         <w:tc>
           <w:tcPr>
             <w:tcW w:type="dxa" w:w="567"/>
+            <w:tcMar>
+              <w:top w:w="100" w:type="dxa"/>
+              <w:bottom w:w="100" w:type="dxa"/>
+              <w:left w:w="120" w:type="dxa"/>
+              <w:right w:w="120" w:type="dxa"/>
+            </w:tcMar>
           </w:tcPr>
           <w:p>
             <w:pPr>
@@ -3295,7 +3754,7 @@
             <w:r>
               <w:rPr>
                 <w:rFonts w:ascii="Calibri" w:hAnsi="Calibri"/>
-                <w:sz w:val="22"/>
+                <w:sz w:val="28"/>
               </w:rPr>
               <w:t>☐</w:t>
             </w:r>
@@ -3304,6 +3763,12 @@
         <w:tc>
           <w:tcPr>
             <w:tcW w:type="dxa" w:w="680"/>
+            <w:tcMar>
+              <w:top w:w="100" w:type="dxa"/>
+              <w:bottom w:w="100" w:type="dxa"/>
+              <w:left w:w="120" w:type="dxa"/>
+              <w:right w:w="120" w:type="dxa"/>
+            </w:tcMar>
           </w:tcPr>
           <w:p>
             <w:pPr>
@@ -3312,7 +3777,7 @@
             <w:r>
               <w:rPr>
                 <w:rFonts w:ascii="Calibri" w:hAnsi="Calibri"/>
-                <w:sz w:val="22"/>
+                <w:sz w:val="28"/>
               </w:rPr>
               <w:t>☐</w:t>
             </w:r>
@@ -3323,6 +3788,12 @@
         <w:tc>
           <w:tcPr>
             <w:tcW w:type="dxa" w:w="510"/>
+            <w:tcMar>
+              <w:top w:w="100" w:type="dxa"/>
+              <w:bottom w:w="100" w:type="dxa"/>
+              <w:left w:w="120" w:type="dxa"/>
+              <w:right w:w="120" w:type="dxa"/>
+            </w:tcMar>
           </w:tcPr>
           <w:p>
             <w:pPr>
@@ -3331,7 +3802,8 @@
             <w:r>
               <w:rPr>
                 <w:rFonts w:ascii="Calibri" w:hAnsi="Calibri"/>
-                <w:sz w:val="18"/>
+                <w:b/>
+                <w:sz w:val="20"/>
               </w:rPr>
               <w:t>16</w:t>
             </w:r>
@@ -3340,13 +3812,19 @@
         <w:tc>
           <w:tcPr>
             <w:tcW w:type="dxa" w:w="7483"/>
+            <w:tcMar>
+              <w:top w:w="100" w:type="dxa"/>
+              <w:bottom w:w="100" w:type="dxa"/>
+              <w:left w:w="120" w:type="dxa"/>
+              <w:right w:w="120" w:type="dxa"/>
+            </w:tcMar>
           </w:tcPr>
           <w:p>
             <w:r>
               <w:rPr>
                 <w:rFonts w:ascii="Calibri" w:hAnsi="Calibri"/>
                 <w:color w:val="1A1F2C"/>
-                <w:sz w:val="18"/>
+                <w:sz w:val="20"/>
               </w:rPr>
               <w:t>Field wiring is labelled and correctly terminated in all control and ancillary equipment.</w:t>
             </w:r>
@@ -3355,6 +3833,12 @@
         <w:tc>
           <w:tcPr>
             <w:tcW w:type="dxa" w:w="567"/>
+            <w:tcMar>
+              <w:top w:w="100" w:type="dxa"/>
+              <w:bottom w:w="100" w:type="dxa"/>
+              <w:left w:w="120" w:type="dxa"/>
+              <w:right w:w="120" w:type="dxa"/>
+            </w:tcMar>
           </w:tcPr>
           <w:p>
             <w:pPr>
@@ -3363,7 +3847,7 @@
             <w:r>
               <w:rPr>
                 <w:rFonts w:ascii="Calibri" w:hAnsi="Calibri"/>
-                <w:sz w:val="22"/>
+                <w:sz w:val="28"/>
               </w:rPr>
               <w:t>☐</w:t>
             </w:r>
@@ -3372,6 +3856,12 @@
         <w:tc>
           <w:tcPr>
             <w:tcW w:type="dxa" w:w="567"/>
+            <w:tcMar>
+              <w:top w:w="100" w:type="dxa"/>
+              <w:bottom w:w="100" w:type="dxa"/>
+              <w:left w:w="120" w:type="dxa"/>
+              <w:right w:w="120" w:type="dxa"/>
+            </w:tcMar>
           </w:tcPr>
           <w:p>
             <w:pPr>
@@ -3380,7 +3870,7 @@
             <w:r>
               <w:rPr>
                 <w:rFonts w:ascii="Calibri" w:hAnsi="Calibri"/>
-                <w:sz w:val="22"/>
+                <w:sz w:val="28"/>
               </w:rPr>
               <w:t>☐</w:t>
             </w:r>
@@ -3389,6 +3879,12 @@
         <w:tc>
           <w:tcPr>
             <w:tcW w:type="dxa" w:w="680"/>
+            <w:tcMar>
+              <w:top w:w="100" w:type="dxa"/>
+              <w:bottom w:w="100" w:type="dxa"/>
+              <w:left w:w="120" w:type="dxa"/>
+              <w:right w:w="120" w:type="dxa"/>
+            </w:tcMar>
           </w:tcPr>
           <w:p>
             <w:pPr>
@@ -3397,7 +3893,7 @@
             <w:r>
               <w:rPr>
                 <w:rFonts w:ascii="Calibri" w:hAnsi="Calibri"/>
-                <w:sz w:val="22"/>
+                <w:sz w:val="28"/>
               </w:rPr>
               <w:t>☐</w:t>
             </w:r>
@@ -3408,6 +3904,12 @@
         <w:tc>
           <w:tcPr>
             <w:tcW w:type="dxa" w:w="510"/>
+            <w:tcMar>
+              <w:top w:w="100" w:type="dxa"/>
+              <w:bottom w:w="100" w:type="dxa"/>
+              <w:left w:w="120" w:type="dxa"/>
+              <w:right w:w="120" w:type="dxa"/>
+            </w:tcMar>
           </w:tcPr>
           <w:p>
             <w:pPr>
@@ -3416,7 +3918,8 @@
             <w:r>
               <w:rPr>
                 <w:rFonts w:ascii="Calibri" w:hAnsi="Calibri"/>
-                <w:sz w:val="18"/>
+                <w:b/>
+                <w:sz w:val="20"/>
               </w:rPr>
               <w:t>17</w:t>
             </w:r>
@@ -3425,13 +3928,19 @@
         <w:tc>
           <w:tcPr>
             <w:tcW w:type="dxa" w:w="7483"/>
+            <w:tcMar>
+              <w:top w:w="100" w:type="dxa"/>
+              <w:bottom w:w="100" w:type="dxa"/>
+              <w:left w:w="120" w:type="dxa"/>
+              <w:right w:w="120" w:type="dxa"/>
+            </w:tcMar>
           </w:tcPr>
           <w:p>
             <w:r>
               <w:rPr>
                 <w:rFonts w:ascii="Calibri" w:hAnsi="Calibri"/>
                 <w:color w:val="1A1F2C"/>
-                <w:sz w:val="18"/>
+                <w:sz w:val="20"/>
               </w:rPr>
               <w:t>Detector removal fault indication has been checked and tested (§12.2.1).</w:t>
             </w:r>
@@ -3440,6 +3949,12 @@
         <w:tc>
           <w:tcPr>
             <w:tcW w:type="dxa" w:w="567"/>
+            <w:tcMar>
+              <w:top w:w="100" w:type="dxa"/>
+              <w:bottom w:w="100" w:type="dxa"/>
+              <w:left w:w="120" w:type="dxa"/>
+              <w:right w:w="120" w:type="dxa"/>
+            </w:tcMar>
           </w:tcPr>
           <w:p>
             <w:pPr>
@@ -3448,7 +3963,7 @@
             <w:r>
               <w:rPr>
                 <w:rFonts w:ascii="Calibri" w:hAnsi="Calibri"/>
-                <w:sz w:val="22"/>
+                <w:sz w:val="28"/>
               </w:rPr>
               <w:t>☐</w:t>
             </w:r>
@@ -3457,6 +3972,12 @@
         <w:tc>
           <w:tcPr>
             <w:tcW w:type="dxa" w:w="567"/>
+            <w:tcMar>
+              <w:top w:w="100" w:type="dxa"/>
+              <w:bottom w:w="100" w:type="dxa"/>
+              <w:left w:w="120" w:type="dxa"/>
+              <w:right w:w="120" w:type="dxa"/>
+            </w:tcMar>
           </w:tcPr>
           <w:p>
             <w:pPr>
@@ -3465,7 +3986,7 @@
             <w:r>
               <w:rPr>
                 <w:rFonts w:ascii="Calibri" w:hAnsi="Calibri"/>
-                <w:sz w:val="22"/>
+                <w:sz w:val="28"/>
               </w:rPr>
               <w:t>☐</w:t>
             </w:r>
@@ -3474,6 +3995,12 @@
         <w:tc>
           <w:tcPr>
             <w:tcW w:type="dxa" w:w="680"/>
+            <w:tcMar>
+              <w:top w:w="100" w:type="dxa"/>
+              <w:bottom w:w="100" w:type="dxa"/>
+              <w:left w:w="120" w:type="dxa"/>
+              <w:right w:w="120" w:type="dxa"/>
+            </w:tcMar>
           </w:tcPr>
           <w:p>
             <w:pPr>
@@ -3482,7 +4009,7 @@
             <w:r>
               <w:rPr>
                 <w:rFonts w:ascii="Calibri" w:hAnsi="Calibri"/>
-                <w:sz w:val="22"/>
+                <w:sz w:val="28"/>
               </w:rPr>
               <w:t>☐</w:t>
             </w:r>
@@ -3493,6 +4020,12 @@
         <w:tc>
           <w:tcPr>
             <w:tcW w:type="dxa" w:w="510"/>
+            <w:tcMar>
+              <w:top w:w="100" w:type="dxa"/>
+              <w:bottom w:w="100" w:type="dxa"/>
+              <w:left w:w="120" w:type="dxa"/>
+              <w:right w:w="120" w:type="dxa"/>
+            </w:tcMar>
           </w:tcPr>
           <w:p>
             <w:pPr>
@@ -3501,7 +4034,8 @@
             <w:r>
               <w:rPr>
                 <w:rFonts w:ascii="Calibri" w:hAnsi="Calibri"/>
-                <w:sz w:val="18"/>
+                <w:b/>
+                <w:sz w:val="20"/>
               </w:rPr>
               <w:t>18</w:t>
             </w:r>
@@ -3510,13 +4044,19 @@
         <w:tc>
           <w:tcPr>
             <w:tcW w:type="dxa" w:w="7483"/>
+            <w:tcMar>
+              <w:top w:w="100" w:type="dxa"/>
+              <w:bottom w:w="100" w:type="dxa"/>
+              <w:left w:w="120" w:type="dxa"/>
+              <w:right w:w="120" w:type="dxa"/>
+            </w:tcMar>
           </w:tcPr>
           <w:p>
             <w:r>
               <w:rPr>
                 <w:rFonts w:ascii="Calibri" w:hAnsi="Calibri"/>
                 <w:color w:val="1A1F2C"/>
-                <w:sz w:val="18"/>
+                <w:sz w:val="20"/>
               </w:rPr>
               <w:t>Short circuit fault indication has been checked and tested.</w:t>
             </w:r>
@@ -3525,6 +4065,12 @@
         <w:tc>
           <w:tcPr>
             <w:tcW w:type="dxa" w:w="567"/>
+            <w:tcMar>
+              <w:top w:w="100" w:type="dxa"/>
+              <w:bottom w:w="100" w:type="dxa"/>
+              <w:left w:w="120" w:type="dxa"/>
+              <w:right w:w="120" w:type="dxa"/>
+            </w:tcMar>
           </w:tcPr>
           <w:p>
             <w:pPr>
@@ -3533,7 +4079,7 @@
             <w:r>
               <w:rPr>
                 <w:rFonts w:ascii="Calibri" w:hAnsi="Calibri"/>
-                <w:sz w:val="22"/>
+                <w:sz w:val="28"/>
               </w:rPr>
               <w:t>☐</w:t>
             </w:r>
@@ -3542,6 +4088,12 @@
         <w:tc>
           <w:tcPr>
             <w:tcW w:type="dxa" w:w="567"/>
+            <w:tcMar>
+              <w:top w:w="100" w:type="dxa"/>
+              <w:bottom w:w="100" w:type="dxa"/>
+              <w:left w:w="120" w:type="dxa"/>
+              <w:right w:w="120" w:type="dxa"/>
+            </w:tcMar>
           </w:tcPr>
           <w:p>
             <w:pPr>
@@ -3550,7 +4102,7 @@
             <w:r>
               <w:rPr>
                 <w:rFonts w:ascii="Calibri" w:hAnsi="Calibri"/>
-                <w:sz w:val="22"/>
+                <w:sz w:val="28"/>
               </w:rPr>
               <w:t>☐</w:t>
             </w:r>
@@ -3559,6 +4111,12 @@
         <w:tc>
           <w:tcPr>
             <w:tcW w:type="dxa" w:w="680"/>
+            <w:tcMar>
+              <w:top w:w="100" w:type="dxa"/>
+              <w:bottom w:w="100" w:type="dxa"/>
+              <w:left w:w="120" w:type="dxa"/>
+              <w:right w:w="120" w:type="dxa"/>
+            </w:tcMar>
           </w:tcPr>
           <w:p>
             <w:pPr>
@@ -3567,7 +4125,7 @@
             <w:r>
               <w:rPr>
                 <w:rFonts w:ascii="Calibri" w:hAnsi="Calibri"/>
-                <w:sz w:val="22"/>
+                <w:sz w:val="28"/>
               </w:rPr>
               <w:t>☐</w:t>
             </w:r>
@@ -3578,6 +4136,12 @@
         <w:tc>
           <w:tcPr>
             <w:tcW w:type="dxa" w:w="510"/>
+            <w:tcMar>
+              <w:top w:w="100" w:type="dxa"/>
+              <w:bottom w:w="100" w:type="dxa"/>
+              <w:left w:w="120" w:type="dxa"/>
+              <w:right w:w="120" w:type="dxa"/>
+            </w:tcMar>
           </w:tcPr>
           <w:p>
             <w:pPr>
@@ -3586,7 +4150,8 @@
             <w:r>
               <w:rPr>
                 <w:rFonts w:ascii="Calibri" w:hAnsi="Calibri"/>
-                <w:sz w:val="18"/>
+                <w:b/>
+                <w:sz w:val="20"/>
               </w:rPr>
               <w:t>19</w:t>
             </w:r>
@@ -3595,13 +4160,19 @@
         <w:tc>
           <w:tcPr>
             <w:tcW w:type="dxa" w:w="7483"/>
+            <w:tcMar>
+              <w:top w:w="100" w:type="dxa"/>
+              <w:bottom w:w="100" w:type="dxa"/>
+              <w:left w:w="120" w:type="dxa"/>
+              <w:right w:w="120" w:type="dxa"/>
+            </w:tcMar>
           </w:tcPr>
           <w:p>
             <w:r>
               <w:rPr>
                 <w:rFonts w:ascii="Calibri" w:hAnsi="Calibri"/>
                 <w:color w:val="1A1F2C"/>
-                <w:sz w:val="18"/>
+                <w:sz w:val="20"/>
               </w:rPr>
               <w:t>ALL detection, MCPs, warning and ancillary devices have been tested for control operation and results recorded.</w:t>
             </w:r>
@@ -3610,6 +4181,12 @@
         <w:tc>
           <w:tcPr>
             <w:tcW w:type="dxa" w:w="567"/>
+            <w:tcMar>
+              <w:top w:w="100" w:type="dxa"/>
+              <w:bottom w:w="100" w:type="dxa"/>
+              <w:left w:w="120" w:type="dxa"/>
+              <w:right w:w="120" w:type="dxa"/>
+            </w:tcMar>
           </w:tcPr>
           <w:p>
             <w:pPr>
@@ -3618,7 +4195,7 @@
             <w:r>
               <w:rPr>
                 <w:rFonts w:ascii="Calibri" w:hAnsi="Calibri"/>
-                <w:sz w:val="22"/>
+                <w:sz w:val="28"/>
               </w:rPr>
               <w:t>☐</w:t>
             </w:r>
@@ -3627,6 +4204,12 @@
         <w:tc>
           <w:tcPr>
             <w:tcW w:type="dxa" w:w="567"/>
+            <w:tcMar>
+              <w:top w:w="100" w:type="dxa"/>
+              <w:bottom w:w="100" w:type="dxa"/>
+              <w:left w:w="120" w:type="dxa"/>
+              <w:right w:w="120" w:type="dxa"/>
+            </w:tcMar>
           </w:tcPr>
           <w:p>
             <w:pPr>
@@ -3635,7 +4218,7 @@
             <w:r>
               <w:rPr>
                 <w:rFonts w:ascii="Calibri" w:hAnsi="Calibri"/>
-                <w:sz w:val="22"/>
+                <w:sz w:val="28"/>
               </w:rPr>
               <w:t>☐</w:t>
             </w:r>
@@ -3644,6 +4227,12 @@
         <w:tc>
           <w:tcPr>
             <w:tcW w:type="dxa" w:w="680"/>
+            <w:tcMar>
+              <w:top w:w="100" w:type="dxa"/>
+              <w:bottom w:w="100" w:type="dxa"/>
+              <w:left w:w="120" w:type="dxa"/>
+              <w:right w:w="120" w:type="dxa"/>
+            </w:tcMar>
           </w:tcPr>
           <w:p>
             <w:pPr>
@@ -3652,7 +4241,7 @@
             <w:r>
               <w:rPr>
                 <w:rFonts w:ascii="Calibri" w:hAnsi="Calibri"/>
-                <w:sz w:val="22"/>
+                <w:sz w:val="28"/>
               </w:rPr>
               <w:t>☐</w:t>
             </w:r>
@@ -3663,6 +4252,12 @@
         <w:tc>
           <w:tcPr>
             <w:tcW w:type="dxa" w:w="510"/>
+            <w:tcMar>
+              <w:top w:w="100" w:type="dxa"/>
+              <w:bottom w:w="100" w:type="dxa"/>
+              <w:left w:w="120" w:type="dxa"/>
+              <w:right w:w="120" w:type="dxa"/>
+            </w:tcMar>
           </w:tcPr>
           <w:p>
             <w:pPr>
@@ -3671,7 +4266,8 @@
             <w:r>
               <w:rPr>
                 <w:rFonts w:ascii="Calibri" w:hAnsi="Calibri"/>
-                <w:sz w:val="18"/>
+                <w:b/>
+                <w:sz w:val="20"/>
               </w:rPr>
               <w:t>20</w:t>
             </w:r>
@@ -3680,13 +4276,19 @@
         <w:tc>
           <w:tcPr>
             <w:tcW w:type="dxa" w:w="7483"/>
+            <w:tcMar>
+              <w:top w:w="100" w:type="dxa"/>
+              <w:bottom w:w="100" w:type="dxa"/>
+              <w:left w:w="120" w:type="dxa"/>
+              <w:right w:w="120" w:type="dxa"/>
+            </w:tcMar>
           </w:tcPr>
           <w:p>
             <w:r>
               <w:rPr>
                 <w:rFonts w:ascii="Calibri" w:hAnsi="Calibri"/>
                 <w:color w:val="1A1F2C"/>
-                <w:sz w:val="18"/>
+                <w:sz w:val="20"/>
               </w:rPr>
               <w:t>Cause and effect on the system has been tested and results recorded.</w:t>
             </w:r>
@@ -3695,6 +4297,12 @@
         <w:tc>
           <w:tcPr>
             <w:tcW w:type="dxa" w:w="567"/>
+            <w:tcMar>
+              <w:top w:w="100" w:type="dxa"/>
+              <w:bottom w:w="100" w:type="dxa"/>
+              <w:left w:w="120" w:type="dxa"/>
+              <w:right w:w="120" w:type="dxa"/>
+            </w:tcMar>
           </w:tcPr>
           <w:p>
             <w:pPr>
@@ -3703,7 +4311,7 @@
             <w:r>
               <w:rPr>
                 <w:rFonts w:ascii="Calibri" w:hAnsi="Calibri"/>
-                <w:sz w:val="22"/>
+                <w:sz w:val="28"/>
               </w:rPr>
               <w:t>☐</w:t>
             </w:r>
@@ -3712,6 +4320,12 @@
         <w:tc>
           <w:tcPr>
             <w:tcW w:type="dxa" w:w="567"/>
+            <w:tcMar>
+              <w:top w:w="100" w:type="dxa"/>
+              <w:bottom w:w="100" w:type="dxa"/>
+              <w:left w:w="120" w:type="dxa"/>
+              <w:right w:w="120" w:type="dxa"/>
+            </w:tcMar>
           </w:tcPr>
           <w:p>
             <w:pPr>
@@ -3720,7 +4334,7 @@
             <w:r>
               <w:rPr>
                 <w:rFonts w:ascii="Calibri" w:hAnsi="Calibri"/>
-                <w:sz w:val="22"/>
+                <w:sz w:val="28"/>
               </w:rPr>
               <w:t>☐</w:t>
             </w:r>
@@ -3729,6 +4343,12 @@
         <w:tc>
           <w:tcPr>
             <w:tcW w:type="dxa" w:w="680"/>
+            <w:tcMar>
+              <w:top w:w="100" w:type="dxa"/>
+              <w:bottom w:w="100" w:type="dxa"/>
+              <w:left w:w="120" w:type="dxa"/>
+              <w:right w:w="120" w:type="dxa"/>
+            </w:tcMar>
           </w:tcPr>
           <w:p>
             <w:pPr>
@@ -3737,7 +4357,7 @@
             <w:r>
               <w:rPr>
                 <w:rFonts w:ascii="Calibri" w:hAnsi="Calibri"/>
-                <w:sz w:val="22"/>
+                <w:sz w:val="28"/>
               </w:rPr>
               <w:t>☐</w:t>
             </w:r>
@@ -3748,6 +4368,12 @@
         <w:tc>
           <w:tcPr>
             <w:tcW w:type="dxa" w:w="510"/>
+            <w:tcMar>
+              <w:top w:w="100" w:type="dxa"/>
+              <w:bottom w:w="100" w:type="dxa"/>
+              <w:left w:w="120" w:type="dxa"/>
+              <w:right w:w="120" w:type="dxa"/>
+            </w:tcMar>
           </w:tcPr>
           <w:p>
             <w:pPr>
@@ -3756,7 +4382,8 @@
             <w:r>
               <w:rPr>
                 <w:rFonts w:ascii="Calibri" w:hAnsi="Calibri"/>
-                <w:sz w:val="18"/>
+                <w:b/>
+                <w:sz w:val="20"/>
               </w:rPr>
               <w:t>21</w:t>
             </w:r>
@@ -3765,13 +4392,19 @@
         <w:tc>
           <w:tcPr>
             <w:tcW w:type="dxa" w:w="7483"/>
+            <w:tcMar>
+              <w:top w:w="100" w:type="dxa"/>
+              <w:bottom w:w="100" w:type="dxa"/>
+              <w:left w:w="120" w:type="dxa"/>
+              <w:right w:w="120" w:type="dxa"/>
+            </w:tcMar>
           </w:tcPr>
           <w:p>
             <w:r>
               <w:rPr>
                 <w:rFonts w:ascii="Calibri" w:hAnsi="Calibri"/>
                 <w:color w:val="1A1F2C"/>
-                <w:sz w:val="18"/>
+                <w:sz w:val="20"/>
               </w:rPr>
               <w:t>Provision of sounder circuits is appropriate (§16.2).</w:t>
             </w:r>
@@ -3780,6 +4413,12 @@
         <w:tc>
           <w:tcPr>
             <w:tcW w:type="dxa" w:w="567"/>
+            <w:tcMar>
+              <w:top w:w="100" w:type="dxa"/>
+              <w:bottom w:w="100" w:type="dxa"/>
+              <w:left w:w="120" w:type="dxa"/>
+              <w:right w:w="120" w:type="dxa"/>
+            </w:tcMar>
           </w:tcPr>
           <w:p>
             <w:pPr>
@@ -3788,7 +4427,7 @@
             <w:r>
               <w:rPr>
                 <w:rFonts w:ascii="Calibri" w:hAnsi="Calibri"/>
-                <w:sz w:val="22"/>
+                <w:sz w:val="28"/>
               </w:rPr>
               <w:t>☐</w:t>
             </w:r>
@@ -3797,6 +4436,12 @@
         <w:tc>
           <w:tcPr>
             <w:tcW w:type="dxa" w:w="567"/>
+            <w:tcMar>
+              <w:top w:w="100" w:type="dxa"/>
+              <w:bottom w:w="100" w:type="dxa"/>
+              <w:left w:w="120" w:type="dxa"/>
+              <w:right w:w="120" w:type="dxa"/>
+            </w:tcMar>
           </w:tcPr>
           <w:p>
             <w:pPr>
@@ -3805,7 +4450,7 @@
             <w:r>
               <w:rPr>
                 <w:rFonts w:ascii="Calibri" w:hAnsi="Calibri"/>
-                <w:sz w:val="22"/>
+                <w:sz w:val="28"/>
               </w:rPr>
               <w:t>☐</w:t>
             </w:r>
@@ -3814,6 +4459,12 @@
         <w:tc>
           <w:tcPr>
             <w:tcW w:type="dxa" w:w="680"/>
+            <w:tcMar>
+              <w:top w:w="100" w:type="dxa"/>
+              <w:bottom w:w="100" w:type="dxa"/>
+              <w:left w:w="120" w:type="dxa"/>
+              <w:right w:w="120" w:type="dxa"/>
+            </w:tcMar>
           </w:tcPr>
           <w:p>
             <w:pPr>
@@ -3822,7 +4473,7 @@
             <w:r>
               <w:rPr>
                 <w:rFonts w:ascii="Calibri" w:hAnsi="Calibri"/>
-                <w:sz w:val="22"/>
+                <w:sz w:val="28"/>
               </w:rPr>
               <w:t>☐</w:t>
             </w:r>
@@ -3833,6 +4484,12 @@
         <w:tc>
           <w:tcPr>
             <w:tcW w:type="dxa" w:w="510"/>
+            <w:tcMar>
+              <w:top w:w="100" w:type="dxa"/>
+              <w:bottom w:w="100" w:type="dxa"/>
+              <w:left w:w="120" w:type="dxa"/>
+              <w:right w:w="120" w:type="dxa"/>
+            </w:tcMar>
           </w:tcPr>
           <w:p>
             <w:pPr>
@@ -3841,7 +4498,8 @@
             <w:r>
               <w:rPr>
                 <w:rFonts w:ascii="Calibri" w:hAnsi="Calibri"/>
-                <w:sz w:val="18"/>
+                <w:b/>
+                <w:sz w:val="20"/>
               </w:rPr>
               <w:t>22</w:t>
             </w:r>
@@ -3850,13 +4508,19 @@
         <w:tc>
           <w:tcPr>
             <w:tcW w:type="dxa" w:w="7483"/>
+            <w:tcMar>
+              <w:top w:w="100" w:type="dxa"/>
+              <w:bottom w:w="100" w:type="dxa"/>
+              <w:left w:w="120" w:type="dxa"/>
+              <w:right w:w="120" w:type="dxa"/>
+            </w:tcMar>
           </w:tcPr>
           <w:p>
             <w:r>
               <w:rPr>
                 <w:rFonts w:ascii="Calibri" w:hAnsi="Calibri"/>
                 <w:color w:val="1A1F2C"/>
-                <w:sz w:val="18"/>
+                <w:sz w:val="20"/>
               </w:rPr>
               <w:t>Sound pressure levels have been checked and recorded (§16.2).</w:t>
             </w:r>
@@ -3865,6 +4529,12 @@
         <w:tc>
           <w:tcPr>
             <w:tcW w:type="dxa" w:w="567"/>
+            <w:tcMar>
+              <w:top w:w="100" w:type="dxa"/>
+              <w:bottom w:w="100" w:type="dxa"/>
+              <w:left w:w="120" w:type="dxa"/>
+              <w:right w:w="120" w:type="dxa"/>
+            </w:tcMar>
           </w:tcPr>
           <w:p>
             <w:pPr>
@@ -3873,7 +4543,7 @@
             <w:r>
               <w:rPr>
                 <w:rFonts w:ascii="Calibri" w:hAnsi="Calibri"/>
-                <w:sz w:val="22"/>
+                <w:sz w:val="28"/>
               </w:rPr>
               <w:t>☐</w:t>
             </w:r>
@@ -3882,6 +4552,12 @@
         <w:tc>
           <w:tcPr>
             <w:tcW w:type="dxa" w:w="567"/>
+            <w:tcMar>
+              <w:top w:w="100" w:type="dxa"/>
+              <w:bottom w:w="100" w:type="dxa"/>
+              <w:left w:w="120" w:type="dxa"/>
+              <w:right w:w="120" w:type="dxa"/>
+            </w:tcMar>
           </w:tcPr>
           <w:p>
             <w:pPr>
@@ -3890,7 +4566,7 @@
             <w:r>
               <w:rPr>
                 <w:rFonts w:ascii="Calibri" w:hAnsi="Calibri"/>
-                <w:sz w:val="22"/>
+                <w:sz w:val="28"/>
               </w:rPr>
               <w:t>☐</w:t>
             </w:r>
@@ -3899,6 +4575,12 @@
         <w:tc>
           <w:tcPr>
             <w:tcW w:type="dxa" w:w="680"/>
+            <w:tcMar>
+              <w:top w:w="100" w:type="dxa"/>
+              <w:bottom w:w="100" w:type="dxa"/>
+              <w:left w:w="120" w:type="dxa"/>
+              <w:right w:w="120" w:type="dxa"/>
+            </w:tcMar>
           </w:tcPr>
           <w:p>
             <w:pPr>
@@ -3907,7 +4589,7 @@
             <w:r>
               <w:rPr>
                 <w:rFonts w:ascii="Calibri" w:hAnsi="Calibri"/>
-                <w:sz w:val="22"/>
+                <w:sz w:val="28"/>
               </w:rPr>
               <w:t>☐</w:t>
             </w:r>
@@ -3918,6 +4600,12 @@
         <w:tc>
           <w:tcPr>
             <w:tcW w:type="dxa" w:w="510"/>
+            <w:tcMar>
+              <w:top w:w="100" w:type="dxa"/>
+              <w:bottom w:w="100" w:type="dxa"/>
+              <w:left w:w="120" w:type="dxa"/>
+              <w:right w:w="120" w:type="dxa"/>
+            </w:tcMar>
           </w:tcPr>
           <w:p>
             <w:pPr>
@@ -3926,7 +4614,8 @@
             <w:r>
               <w:rPr>
                 <w:rFonts w:ascii="Calibri" w:hAnsi="Calibri"/>
-                <w:sz w:val="18"/>
+                <w:b/>
+                <w:sz w:val="20"/>
               </w:rPr>
               <w:t>23</w:t>
             </w:r>
@@ -3935,13 +4624,19 @@
         <w:tc>
           <w:tcPr>
             <w:tcW w:type="dxa" w:w="7483"/>
+            <w:tcMar>
+              <w:top w:w="100" w:type="dxa"/>
+              <w:bottom w:w="100" w:type="dxa"/>
+              <w:left w:w="120" w:type="dxa"/>
+              <w:right w:w="120" w:type="dxa"/>
+            </w:tcMar>
           </w:tcPr>
           <w:p>
             <w:r>
               <w:rPr>
                 <w:rFonts w:ascii="Calibri" w:hAnsi="Calibri"/>
                 <w:color w:val="1A1F2C"/>
-                <w:sz w:val="18"/>
+                <w:sz w:val="20"/>
               </w:rPr>
               <w:t>Detector type and spacing is appropriate to the system category (§22.2).</w:t>
             </w:r>
@@ -3950,6 +4645,12 @@
         <w:tc>
           <w:tcPr>
             <w:tcW w:type="dxa" w:w="567"/>
+            <w:tcMar>
+              <w:top w:w="100" w:type="dxa"/>
+              <w:bottom w:w="100" w:type="dxa"/>
+              <w:left w:w="120" w:type="dxa"/>
+              <w:right w:w="120" w:type="dxa"/>
+            </w:tcMar>
           </w:tcPr>
           <w:p>
             <w:pPr>
@@ -3958,7 +4659,7 @@
             <w:r>
               <w:rPr>
                 <w:rFonts w:ascii="Calibri" w:hAnsi="Calibri"/>
-                <w:sz w:val="22"/>
+                <w:sz w:val="28"/>
               </w:rPr>
               <w:t>☐</w:t>
             </w:r>
@@ -3967,6 +4668,12 @@
         <w:tc>
           <w:tcPr>
             <w:tcW w:type="dxa" w:w="567"/>
+            <w:tcMar>
+              <w:top w:w="100" w:type="dxa"/>
+              <w:bottom w:w="100" w:type="dxa"/>
+              <w:left w:w="120" w:type="dxa"/>
+              <w:right w:w="120" w:type="dxa"/>
+            </w:tcMar>
           </w:tcPr>
           <w:p>
             <w:pPr>
@@ -3975,7 +4682,7 @@
             <w:r>
               <w:rPr>
                 <w:rFonts w:ascii="Calibri" w:hAnsi="Calibri"/>
-                <w:sz w:val="22"/>
+                <w:sz w:val="28"/>
               </w:rPr>
               <w:t>☐</w:t>
             </w:r>
@@ -3984,6 +4691,12 @@
         <w:tc>
           <w:tcPr>
             <w:tcW w:type="dxa" w:w="680"/>
+            <w:tcMar>
+              <w:top w:w="100" w:type="dxa"/>
+              <w:bottom w:w="100" w:type="dxa"/>
+              <w:left w:w="120" w:type="dxa"/>
+              <w:right w:w="120" w:type="dxa"/>
+            </w:tcMar>
           </w:tcPr>
           <w:p>
             <w:pPr>
@@ -3992,7 +4705,7 @@
             <w:r>
               <w:rPr>
                 <w:rFonts w:ascii="Calibri" w:hAnsi="Calibri"/>
-                <w:sz w:val="22"/>
+                <w:sz w:val="28"/>
               </w:rPr>
               <w:t>☐</w:t>
             </w:r>
@@ -4003,6 +4716,12 @@
         <w:tc>
           <w:tcPr>
             <w:tcW w:type="dxa" w:w="510"/>
+            <w:tcMar>
+              <w:top w:w="100" w:type="dxa"/>
+              <w:bottom w:w="100" w:type="dxa"/>
+              <w:left w:w="120" w:type="dxa"/>
+              <w:right w:w="120" w:type="dxa"/>
+            </w:tcMar>
           </w:tcPr>
           <w:p>
             <w:pPr>
@@ -4011,7 +4730,8 @@
             <w:r>
               <w:rPr>
                 <w:rFonts w:ascii="Calibri" w:hAnsi="Calibri"/>
-                <w:sz w:val="18"/>
+                <w:b/>
+                <w:sz w:val="20"/>
               </w:rPr>
               <w:t>24</w:t>
             </w:r>
@@ -4020,13 +4740,19 @@
         <w:tc>
           <w:tcPr>
             <w:tcW w:type="dxa" w:w="7483"/>
+            <w:tcMar>
+              <w:top w:w="100" w:type="dxa"/>
+              <w:bottom w:w="100" w:type="dxa"/>
+              <w:left w:w="120" w:type="dxa"/>
+              <w:right w:w="120" w:type="dxa"/>
+            </w:tcMar>
           </w:tcPr>
           <w:p>
             <w:r>
               <w:rPr>
                 <w:rFonts w:ascii="Calibri" w:hAnsi="Calibri"/>
                 <w:color w:val="1A1F2C"/>
-                <w:sz w:val="18"/>
+                <w:sz w:val="20"/>
               </w:rPr>
               <w:t>MCPs are located correctly and travel distances do not exceed 45 m (§22.2).</w:t>
             </w:r>
@@ -4035,6 +4761,12 @@
         <w:tc>
           <w:tcPr>
             <w:tcW w:type="dxa" w:w="567"/>
+            <w:tcMar>
+              <w:top w:w="100" w:type="dxa"/>
+              <w:bottom w:w="100" w:type="dxa"/>
+              <w:left w:w="120" w:type="dxa"/>
+              <w:right w:w="120" w:type="dxa"/>
+            </w:tcMar>
           </w:tcPr>
           <w:p>
             <w:pPr>
@@ -4043,7 +4775,7 @@
             <w:r>
               <w:rPr>
                 <w:rFonts w:ascii="Calibri" w:hAnsi="Calibri"/>
-                <w:sz w:val="22"/>
+                <w:sz w:val="28"/>
               </w:rPr>
               <w:t>☐</w:t>
             </w:r>
@@ -4052,6 +4784,12 @@
         <w:tc>
           <w:tcPr>
             <w:tcW w:type="dxa" w:w="567"/>
+            <w:tcMar>
+              <w:top w:w="100" w:type="dxa"/>
+              <w:bottom w:w="100" w:type="dxa"/>
+              <w:left w:w="120" w:type="dxa"/>
+              <w:right w:w="120" w:type="dxa"/>
+            </w:tcMar>
           </w:tcPr>
           <w:p>
             <w:pPr>
@@ -4060,7 +4798,7 @@
             <w:r>
               <w:rPr>
                 <w:rFonts w:ascii="Calibri" w:hAnsi="Calibri"/>
-                <w:sz w:val="22"/>
+                <w:sz w:val="28"/>
               </w:rPr>
               <w:t>☐</w:t>
             </w:r>
@@ -4069,6 +4807,12 @@
         <w:tc>
           <w:tcPr>
             <w:tcW w:type="dxa" w:w="680"/>
+            <w:tcMar>
+              <w:top w:w="100" w:type="dxa"/>
+              <w:bottom w:w="100" w:type="dxa"/>
+              <w:left w:w="120" w:type="dxa"/>
+              <w:right w:w="120" w:type="dxa"/>
+            </w:tcMar>
           </w:tcPr>
           <w:p>
             <w:pPr>
@@ -4077,7 +4821,7 @@
             <w:r>
               <w:rPr>
                 <w:rFonts w:ascii="Calibri" w:hAnsi="Calibri"/>
-                <w:sz w:val="22"/>
+                <w:sz w:val="28"/>
               </w:rPr>
               <w:t>☐</w:t>
             </w:r>
@@ -4088,6 +4832,12 @@
         <w:tc>
           <w:tcPr>
             <w:tcW w:type="dxa" w:w="510"/>
+            <w:tcMar>
+              <w:top w:w="100" w:type="dxa"/>
+              <w:bottom w:w="100" w:type="dxa"/>
+              <w:left w:w="120" w:type="dxa"/>
+              <w:right w:w="120" w:type="dxa"/>
+            </w:tcMar>
           </w:tcPr>
           <w:p>
             <w:pPr>
@@ -4096,7 +4846,8 @@
             <w:r>
               <w:rPr>
                 <w:rFonts w:ascii="Calibri" w:hAnsi="Calibri"/>
-                <w:sz w:val="18"/>
+                <w:b/>
+                <w:sz w:val="20"/>
               </w:rPr>
               <w:t>25</w:t>
             </w:r>
@@ -4105,13 +4856,19 @@
         <w:tc>
           <w:tcPr>
             <w:tcW w:type="dxa" w:w="7483"/>
+            <w:tcMar>
+              <w:top w:w="100" w:type="dxa"/>
+              <w:bottom w:w="100" w:type="dxa"/>
+              <w:left w:w="120" w:type="dxa"/>
+              <w:right w:w="120" w:type="dxa"/>
+            </w:tcMar>
           </w:tcPr>
           <w:p>
             <w:r>
               <w:rPr>
                 <w:rFonts w:ascii="Calibri" w:hAnsi="Calibri"/>
                 <w:color w:val="1A1F2C"/>
-                <w:sz w:val="18"/>
+                <w:sz w:val="20"/>
               </w:rPr>
               <w:t>Remote signalling has been checked and tested for correct operation to ARC (fire and fault).</w:t>
             </w:r>
@@ -4120,6 +4877,12 @@
         <w:tc>
           <w:tcPr>
             <w:tcW w:type="dxa" w:w="567"/>
+            <w:tcMar>
+              <w:top w:w="100" w:type="dxa"/>
+              <w:bottom w:w="100" w:type="dxa"/>
+              <w:left w:w="120" w:type="dxa"/>
+              <w:right w:w="120" w:type="dxa"/>
+            </w:tcMar>
           </w:tcPr>
           <w:p>
             <w:pPr>
@@ -4128,7 +4891,7 @@
             <w:r>
               <w:rPr>
                 <w:rFonts w:ascii="Calibri" w:hAnsi="Calibri"/>
-                <w:sz w:val="22"/>
+                <w:sz w:val="28"/>
               </w:rPr>
               <w:t>☐</w:t>
             </w:r>
@@ -4137,6 +4900,12 @@
         <w:tc>
           <w:tcPr>
             <w:tcW w:type="dxa" w:w="567"/>
+            <w:tcMar>
+              <w:top w:w="100" w:type="dxa"/>
+              <w:bottom w:w="100" w:type="dxa"/>
+              <w:left w:w="120" w:type="dxa"/>
+              <w:right w:w="120" w:type="dxa"/>
+            </w:tcMar>
           </w:tcPr>
           <w:p>
             <w:pPr>
@@ -4145,7 +4914,7 @@
             <w:r>
               <w:rPr>
                 <w:rFonts w:ascii="Calibri" w:hAnsi="Calibri"/>
-                <w:sz w:val="22"/>
+                <w:sz w:val="28"/>
               </w:rPr>
               <w:t>☐</w:t>
             </w:r>
@@ -4154,6 +4923,12 @@
         <w:tc>
           <w:tcPr>
             <w:tcW w:type="dxa" w:w="680"/>
+            <w:tcMar>
+              <w:top w:w="100" w:type="dxa"/>
+              <w:bottom w:w="100" w:type="dxa"/>
+              <w:left w:w="120" w:type="dxa"/>
+              <w:right w:w="120" w:type="dxa"/>
+            </w:tcMar>
           </w:tcPr>
           <w:p>
             <w:pPr>
@@ -4162,7 +4937,7 @@
             <w:r>
               <w:rPr>
                 <w:rFonts w:ascii="Calibri" w:hAnsi="Calibri"/>
-                <w:sz w:val="22"/>
+                <w:sz w:val="28"/>
               </w:rPr>
               <w:t>☐</w:t>
             </w:r>
@@ -4173,6 +4948,12 @@
         <w:tc>
           <w:tcPr>
             <w:tcW w:type="dxa" w:w="510"/>
+            <w:tcMar>
+              <w:top w:w="100" w:type="dxa"/>
+              <w:bottom w:w="100" w:type="dxa"/>
+              <w:left w:w="120" w:type="dxa"/>
+              <w:right w:w="120" w:type="dxa"/>
+            </w:tcMar>
           </w:tcPr>
           <w:p>
             <w:pPr>
@@ -4181,7 +4962,8 @@
             <w:r>
               <w:rPr>
                 <w:rFonts w:ascii="Calibri" w:hAnsi="Calibri"/>
-                <w:sz w:val="18"/>
+                <w:b/>
+                <w:sz w:val="20"/>
               </w:rPr>
               <w:t>26</w:t>
             </w:r>
@@ -4190,13 +4972,19 @@
         <w:tc>
           <w:tcPr>
             <w:tcW w:type="dxa" w:w="7483"/>
+            <w:tcMar>
+              <w:top w:w="100" w:type="dxa"/>
+              <w:bottom w:w="100" w:type="dxa"/>
+              <w:left w:w="120" w:type="dxa"/>
+              <w:right w:w="120" w:type="dxa"/>
+            </w:tcMar>
           </w:tcPr>
           <w:p>
             <w:r>
               <w:rPr>
                 <w:rFonts w:ascii="Calibri" w:hAnsi="Calibri"/>
                 <w:color w:val="1A1F2C"/>
-                <w:sz w:val="18"/>
+                <w:sz w:val="20"/>
               </w:rPr>
               <w:t>Radio signal strength (where applicable) exceeds manufacturer's minimum requirements.</w:t>
             </w:r>
@@ -4205,6 +4993,12 @@
         <w:tc>
           <w:tcPr>
             <w:tcW w:type="dxa" w:w="567"/>
+            <w:tcMar>
+              <w:top w:w="100" w:type="dxa"/>
+              <w:bottom w:w="100" w:type="dxa"/>
+              <w:left w:w="120" w:type="dxa"/>
+              <w:right w:w="120" w:type="dxa"/>
+            </w:tcMar>
           </w:tcPr>
           <w:p>
             <w:pPr>
@@ -4213,7 +5007,7 @@
             <w:r>
               <w:rPr>
                 <w:rFonts w:ascii="Calibri" w:hAnsi="Calibri"/>
-                <w:sz w:val="22"/>
+                <w:sz w:val="28"/>
               </w:rPr>
               <w:t>☐</w:t>
             </w:r>
@@ -4222,6 +5016,12 @@
         <w:tc>
           <w:tcPr>
             <w:tcW w:type="dxa" w:w="567"/>
+            <w:tcMar>
+              <w:top w:w="100" w:type="dxa"/>
+              <w:bottom w:w="100" w:type="dxa"/>
+              <w:left w:w="120" w:type="dxa"/>
+              <w:right w:w="120" w:type="dxa"/>
+            </w:tcMar>
           </w:tcPr>
           <w:p>
             <w:pPr>
@@ -4230,7 +5030,7 @@
             <w:r>
               <w:rPr>
                 <w:rFonts w:ascii="Calibri" w:hAnsi="Calibri"/>
-                <w:sz w:val="22"/>
+                <w:sz w:val="28"/>
               </w:rPr>
               <w:t>☐</w:t>
             </w:r>
@@ -4239,6 +5039,12 @@
         <w:tc>
           <w:tcPr>
             <w:tcW w:type="dxa" w:w="680"/>
+            <w:tcMar>
+              <w:top w:w="100" w:type="dxa"/>
+              <w:bottom w:w="100" w:type="dxa"/>
+              <w:left w:w="120" w:type="dxa"/>
+              <w:right w:w="120" w:type="dxa"/>
+            </w:tcMar>
           </w:tcPr>
           <w:p>
             <w:pPr>
@@ -4247,7 +5053,7 @@
             <w:r>
               <w:rPr>
                 <w:rFonts w:ascii="Calibri" w:hAnsi="Calibri"/>
-                <w:sz w:val="22"/>
+                <w:sz w:val="28"/>
               </w:rPr>
               <w:t>☐</w:t>
             </w:r>
@@ -4258,6 +5064,12 @@
         <w:tc>
           <w:tcPr>
             <w:tcW w:type="dxa" w:w="510"/>
+            <w:tcMar>
+              <w:top w:w="100" w:type="dxa"/>
+              <w:bottom w:w="100" w:type="dxa"/>
+              <w:left w:w="120" w:type="dxa"/>
+              <w:right w:w="120" w:type="dxa"/>
+            </w:tcMar>
           </w:tcPr>
           <w:p>
             <w:pPr>
@@ -4266,7 +5078,8 @@
             <w:r>
               <w:rPr>
                 <w:rFonts w:ascii="Calibri" w:hAnsi="Calibri"/>
-                <w:sz w:val="18"/>
+                <w:b/>
+                <w:sz w:val="20"/>
               </w:rPr>
               <w:t>27</w:t>
             </w:r>
@@ -4275,13 +5088,19 @@
         <w:tc>
           <w:tcPr>
             <w:tcW w:type="dxa" w:w="7483"/>
+            <w:tcMar>
+              <w:top w:w="100" w:type="dxa"/>
+              <w:bottom w:w="100" w:type="dxa"/>
+              <w:left w:w="120" w:type="dxa"/>
+              <w:right w:w="120" w:type="dxa"/>
+            </w:tcMar>
           </w:tcPr>
           <w:p>
             <w:r>
               <w:rPr>
                 <w:rFonts w:ascii="Calibri" w:hAnsi="Calibri"/>
                 <w:color w:val="1A1F2C"/>
-                <w:sz w:val="18"/>
+                <w:sz w:val="20"/>
               </w:rPr>
               <w:t>Cause and effects have been checked and verified.</w:t>
             </w:r>
@@ -4290,6 +5109,12 @@
         <w:tc>
           <w:tcPr>
             <w:tcW w:type="dxa" w:w="567"/>
+            <w:tcMar>
+              <w:top w:w="100" w:type="dxa"/>
+              <w:bottom w:w="100" w:type="dxa"/>
+              <w:left w:w="120" w:type="dxa"/>
+              <w:right w:w="120" w:type="dxa"/>
+            </w:tcMar>
           </w:tcPr>
           <w:p>
             <w:pPr>
@@ -4298,7 +5123,7 @@
             <w:r>
               <w:rPr>
                 <w:rFonts w:ascii="Calibri" w:hAnsi="Calibri"/>
-                <w:sz w:val="22"/>
+                <w:sz w:val="28"/>
               </w:rPr>
               <w:t>☐</w:t>
             </w:r>
@@ -4307,6 +5132,12 @@
         <w:tc>
           <w:tcPr>
             <w:tcW w:type="dxa" w:w="567"/>
+            <w:tcMar>
+              <w:top w:w="100" w:type="dxa"/>
+              <w:bottom w:w="100" w:type="dxa"/>
+              <w:left w:w="120" w:type="dxa"/>
+              <w:right w:w="120" w:type="dxa"/>
+            </w:tcMar>
           </w:tcPr>
           <w:p>
             <w:pPr>
@@ -4315,7 +5146,7 @@
             <w:r>
               <w:rPr>
                 <w:rFonts w:ascii="Calibri" w:hAnsi="Calibri"/>
-                <w:sz w:val="22"/>
+                <w:sz w:val="28"/>
               </w:rPr>
               <w:t>☐</w:t>
             </w:r>
@@ -4324,6 +5155,12 @@
         <w:tc>
           <w:tcPr>
             <w:tcW w:type="dxa" w:w="680"/>
+            <w:tcMar>
+              <w:top w:w="100" w:type="dxa"/>
+              <w:bottom w:w="100" w:type="dxa"/>
+              <w:left w:w="120" w:type="dxa"/>
+              <w:right w:w="120" w:type="dxa"/>
+            </w:tcMar>
           </w:tcPr>
           <w:p>
             <w:pPr>
@@ -4332,7 +5169,7 @@
             <w:r>
               <w:rPr>
                 <w:rFonts w:ascii="Calibri" w:hAnsi="Calibri"/>
-                <w:sz w:val="22"/>
+                <w:sz w:val="28"/>
               </w:rPr>
               <w:t>☐</w:t>
             </w:r>
@@ -4343,6 +5180,12 @@
         <w:tc>
           <w:tcPr>
             <w:tcW w:type="dxa" w:w="510"/>
+            <w:tcMar>
+              <w:top w:w="100" w:type="dxa"/>
+              <w:bottom w:w="100" w:type="dxa"/>
+              <w:left w:w="120" w:type="dxa"/>
+              <w:right w:w="120" w:type="dxa"/>
+            </w:tcMar>
           </w:tcPr>
           <w:p>
             <w:pPr>
@@ -4351,7 +5194,8 @@
             <w:r>
               <w:rPr>
                 <w:rFonts w:ascii="Calibri" w:hAnsi="Calibri"/>
-                <w:sz w:val="18"/>
+                <w:b/>
+                <w:sz w:val="20"/>
               </w:rPr>
               <w:t>28</w:t>
             </w:r>
@@ -4360,13 +5204,19 @@
         <w:tc>
           <w:tcPr>
             <w:tcW w:type="dxa" w:w="7483"/>
+            <w:tcMar>
+              <w:top w:w="100" w:type="dxa"/>
+              <w:bottom w:w="100" w:type="dxa"/>
+              <w:left w:w="120" w:type="dxa"/>
+              <w:right w:w="120" w:type="dxa"/>
+            </w:tcMar>
           </w:tcPr>
           <w:p>
             <w:r>
               <w:rPr>
                 <w:rFonts w:ascii="Calibri" w:hAnsi="Calibri"/>
                 <w:color w:val="1A1F2C"/>
-                <w:sz w:val="18"/>
+                <w:sz w:val="20"/>
               </w:rPr>
               <w:t>Zone charts have been fitted in appropriate locations and with the correct orientation (e.g. adjacent to control equipment and repeaters); search distances do not exceed limits; emergency lighting above.</w:t>
             </w:r>
@@ -4375,6 +5225,12 @@
         <w:tc>
           <w:tcPr>
             <w:tcW w:type="dxa" w:w="567"/>
+            <w:tcMar>
+              <w:top w:w="100" w:type="dxa"/>
+              <w:bottom w:w="100" w:type="dxa"/>
+              <w:left w:w="120" w:type="dxa"/>
+              <w:right w:w="120" w:type="dxa"/>
+            </w:tcMar>
           </w:tcPr>
           <w:p>
             <w:pPr>
@@ -4383,7 +5239,7 @@
             <w:r>
               <w:rPr>
                 <w:rFonts w:ascii="Calibri" w:hAnsi="Calibri"/>
-                <w:sz w:val="22"/>
+                <w:sz w:val="28"/>
               </w:rPr>
               <w:t>☐</w:t>
             </w:r>
@@ -4392,6 +5248,12 @@
         <w:tc>
           <w:tcPr>
             <w:tcW w:type="dxa" w:w="567"/>
+            <w:tcMar>
+              <w:top w:w="100" w:type="dxa"/>
+              <w:bottom w:w="100" w:type="dxa"/>
+              <w:left w:w="120" w:type="dxa"/>
+              <w:right w:w="120" w:type="dxa"/>
+            </w:tcMar>
           </w:tcPr>
           <w:p>
             <w:pPr>
@@ -4400,7 +5262,7 @@
             <w:r>
               <w:rPr>
                 <w:rFonts w:ascii="Calibri" w:hAnsi="Calibri"/>
-                <w:sz w:val="22"/>
+                <w:sz w:val="28"/>
               </w:rPr>
               <w:t>☐</w:t>
             </w:r>
@@ -4409,6 +5271,12 @@
         <w:tc>
           <w:tcPr>
             <w:tcW w:type="dxa" w:w="680"/>
+            <w:tcMar>
+              <w:top w:w="100" w:type="dxa"/>
+              <w:bottom w:w="100" w:type="dxa"/>
+              <w:left w:w="120" w:type="dxa"/>
+              <w:right w:w="120" w:type="dxa"/>
+            </w:tcMar>
           </w:tcPr>
           <w:p>
             <w:pPr>
@@ -4417,7 +5285,7 @@
             <w:r>
               <w:rPr>
                 <w:rFonts w:ascii="Calibri" w:hAnsi="Calibri"/>
-                <w:sz w:val="22"/>
+                <w:sz w:val="28"/>
               </w:rPr>
               <w:t>☐</w:t>
             </w:r>
@@ -4428,6 +5296,12 @@
         <w:tc>
           <w:tcPr>
             <w:tcW w:type="dxa" w:w="510"/>
+            <w:tcMar>
+              <w:top w:w="100" w:type="dxa"/>
+              <w:bottom w:w="100" w:type="dxa"/>
+              <w:left w:w="120" w:type="dxa"/>
+              <w:right w:w="120" w:type="dxa"/>
+            </w:tcMar>
           </w:tcPr>
           <w:p>
             <w:pPr>
@@ -4436,7 +5310,8 @@
             <w:r>
               <w:rPr>
                 <w:rFonts w:ascii="Calibri" w:hAnsi="Calibri"/>
-                <w:sz w:val="18"/>
+                <w:b/>
+                <w:sz w:val="20"/>
               </w:rPr>
               <w:t>29</w:t>
             </w:r>
@@ -4445,13 +5320,19 @@
         <w:tc>
           <w:tcPr>
             <w:tcW w:type="dxa" w:w="7483"/>
+            <w:tcMar>
+              <w:top w:w="100" w:type="dxa"/>
+              <w:bottom w:w="100" w:type="dxa"/>
+              <w:left w:w="120" w:type="dxa"/>
+              <w:right w:w="120" w:type="dxa"/>
+            </w:tcMar>
           </w:tcPr>
           <w:p>
             <w:r>
               <w:rPr>
                 <w:rFonts w:ascii="Calibri" w:hAnsi="Calibri"/>
                 <w:color w:val="1A1F2C"/>
-                <w:sz w:val="18"/>
+                <w:sz w:val="20"/>
               </w:rPr>
               <w:t>'As fitted' drawings are complete and updated where required including cable type and sizes, cable routing, 230V supply, location of all MCPs / detectors / sounders / isolators.</w:t>
             </w:r>
@@ -4460,6 +5341,12 @@
         <w:tc>
           <w:tcPr>
             <w:tcW w:type="dxa" w:w="567"/>
+            <w:tcMar>
+              <w:top w:w="100" w:type="dxa"/>
+              <w:bottom w:w="100" w:type="dxa"/>
+              <w:left w:w="120" w:type="dxa"/>
+              <w:right w:w="120" w:type="dxa"/>
+            </w:tcMar>
           </w:tcPr>
           <w:p>
             <w:pPr>
@@ -4468,7 +5355,7 @@
             <w:r>
               <w:rPr>
                 <w:rFonts w:ascii="Calibri" w:hAnsi="Calibri"/>
-                <w:sz w:val="22"/>
+                <w:sz w:val="28"/>
               </w:rPr>
               <w:t>☐</w:t>
             </w:r>
@@ -4477,6 +5364,12 @@
         <w:tc>
           <w:tcPr>
             <w:tcW w:type="dxa" w:w="567"/>
+            <w:tcMar>
+              <w:top w:w="100" w:type="dxa"/>
+              <w:bottom w:w="100" w:type="dxa"/>
+              <w:left w:w="120" w:type="dxa"/>
+              <w:right w:w="120" w:type="dxa"/>
+            </w:tcMar>
           </w:tcPr>
           <w:p>
             <w:pPr>
@@ -4485,7 +5378,7 @@
             <w:r>
               <w:rPr>
                 <w:rFonts w:ascii="Calibri" w:hAnsi="Calibri"/>
-                <w:sz w:val="22"/>
+                <w:sz w:val="28"/>
               </w:rPr>
               <w:t>☐</w:t>
             </w:r>
@@ -4494,6 +5387,12 @@
         <w:tc>
           <w:tcPr>
             <w:tcW w:type="dxa" w:w="680"/>
+            <w:tcMar>
+              <w:top w:w="100" w:type="dxa"/>
+              <w:bottom w:w="100" w:type="dxa"/>
+              <w:left w:w="120" w:type="dxa"/>
+              <w:right w:w="120" w:type="dxa"/>
+            </w:tcMar>
           </w:tcPr>
           <w:p>
             <w:pPr>
@@ -4502,7 +5401,7 @@
             <w:r>
               <w:rPr>
                 <w:rFonts w:ascii="Calibri" w:hAnsi="Calibri"/>
-                <w:sz w:val="22"/>
+                <w:sz w:val="28"/>
               </w:rPr>
               <w:t>☐</w:t>
             </w:r>
@@ -4513,6 +5412,12 @@
         <w:tc>
           <w:tcPr>
             <w:tcW w:type="dxa" w:w="510"/>
+            <w:tcMar>
+              <w:top w:w="100" w:type="dxa"/>
+              <w:bottom w:w="100" w:type="dxa"/>
+              <w:left w:w="120" w:type="dxa"/>
+              <w:right w:w="120" w:type="dxa"/>
+            </w:tcMar>
           </w:tcPr>
           <w:p>
             <w:pPr>
@@ -4521,7 +5426,8 @@
             <w:r>
               <w:rPr>
                 <w:rFonts w:ascii="Calibri" w:hAnsi="Calibri"/>
-                <w:sz w:val="18"/>
+                <w:b/>
+                <w:sz w:val="20"/>
               </w:rPr>
               <w:t>30</w:t>
             </w:r>
@@ -4530,13 +5436,19 @@
         <w:tc>
           <w:tcPr>
             <w:tcW w:type="dxa" w:w="7483"/>
+            <w:tcMar>
+              <w:top w:w="100" w:type="dxa"/>
+              <w:bottom w:w="100" w:type="dxa"/>
+              <w:left w:w="120" w:type="dxa"/>
+              <w:right w:w="120" w:type="dxa"/>
+            </w:tcMar>
           </w:tcPr>
           <w:p>
             <w:r>
               <w:rPr>
                 <w:rFonts w:ascii="Calibri" w:hAnsi="Calibri"/>
                 <w:color w:val="1A1F2C"/>
-                <w:sz w:val="18"/>
+                <w:sz w:val="20"/>
               </w:rPr>
               <w:t>User handbook and operating instructions have been issued to the 'responsible person'.</w:t>
             </w:r>
@@ -4545,6 +5457,12 @@
         <w:tc>
           <w:tcPr>
             <w:tcW w:type="dxa" w:w="567"/>
+            <w:tcMar>
+              <w:top w:w="100" w:type="dxa"/>
+              <w:bottom w:w="100" w:type="dxa"/>
+              <w:left w:w="120" w:type="dxa"/>
+              <w:right w:w="120" w:type="dxa"/>
+            </w:tcMar>
           </w:tcPr>
           <w:p>
             <w:pPr>
@@ -4553,7 +5471,7 @@
             <w:r>
               <w:rPr>
                 <w:rFonts w:ascii="Calibri" w:hAnsi="Calibri"/>
-                <w:sz w:val="22"/>
+                <w:sz w:val="28"/>
               </w:rPr>
               <w:t>☐</w:t>
             </w:r>
@@ -4562,6 +5480,12 @@
         <w:tc>
           <w:tcPr>
             <w:tcW w:type="dxa" w:w="567"/>
+            <w:tcMar>
+              <w:top w:w="100" w:type="dxa"/>
+              <w:bottom w:w="100" w:type="dxa"/>
+              <w:left w:w="120" w:type="dxa"/>
+              <w:right w:w="120" w:type="dxa"/>
+            </w:tcMar>
           </w:tcPr>
           <w:p>
             <w:pPr>
@@ -4570,7 +5494,7 @@
             <w:r>
               <w:rPr>
                 <w:rFonts w:ascii="Calibri" w:hAnsi="Calibri"/>
-                <w:sz w:val="22"/>
+                <w:sz w:val="28"/>
               </w:rPr>
               <w:t>☐</w:t>
             </w:r>
@@ -4579,6 +5503,12 @@
         <w:tc>
           <w:tcPr>
             <w:tcW w:type="dxa" w:w="680"/>
+            <w:tcMar>
+              <w:top w:w="100" w:type="dxa"/>
+              <w:bottom w:w="100" w:type="dxa"/>
+              <w:left w:w="120" w:type="dxa"/>
+              <w:right w:w="120" w:type="dxa"/>
+            </w:tcMar>
           </w:tcPr>
           <w:p>
             <w:pPr>
@@ -4587,7 +5517,7 @@
             <w:r>
               <w:rPr>
                 <w:rFonts w:ascii="Calibri" w:hAnsi="Calibri"/>
-                <w:sz w:val="22"/>
+                <w:sz w:val="28"/>
               </w:rPr>
               <w:t>☐</w:t>
             </w:r>
@@ -4598,6 +5528,12 @@
         <w:tc>
           <w:tcPr>
             <w:tcW w:type="dxa" w:w="510"/>
+            <w:tcMar>
+              <w:top w:w="100" w:type="dxa"/>
+              <w:bottom w:w="100" w:type="dxa"/>
+              <w:left w:w="120" w:type="dxa"/>
+              <w:right w:w="120" w:type="dxa"/>
+            </w:tcMar>
           </w:tcPr>
           <w:p>
             <w:pPr>
@@ -4606,7 +5542,8 @@
             <w:r>
               <w:rPr>
                 <w:rFonts w:ascii="Calibri" w:hAnsi="Calibri"/>
-                <w:sz w:val="18"/>
+                <w:b/>
+                <w:sz w:val="20"/>
               </w:rPr>
               <w:t>31</w:t>
             </w:r>
@@ -4615,13 +5552,19 @@
         <w:tc>
           <w:tcPr>
             <w:tcW w:type="dxa" w:w="7483"/>
+            <w:tcMar>
+              <w:top w:w="100" w:type="dxa"/>
+              <w:bottom w:w="100" w:type="dxa"/>
+              <w:left w:w="120" w:type="dxa"/>
+              <w:right w:w="120" w:type="dxa"/>
+            </w:tcMar>
           </w:tcPr>
           <w:p>
             <w:r>
               <w:rPr>
                 <w:rFonts w:ascii="Calibri" w:hAnsi="Calibri"/>
                 <w:color w:val="1A1F2C"/>
-                <w:sz w:val="18"/>
+                <w:sz w:val="20"/>
               </w:rPr>
               <w:t>The 'responsible person' has been adequately trained in the use of the fire alarm system; details recorded.</w:t>
             </w:r>
@@ -4630,6 +5573,12 @@
         <w:tc>
           <w:tcPr>
             <w:tcW w:type="dxa" w:w="567"/>
+            <w:tcMar>
+              <w:top w:w="100" w:type="dxa"/>
+              <w:bottom w:w="100" w:type="dxa"/>
+              <w:left w:w="120" w:type="dxa"/>
+              <w:right w:w="120" w:type="dxa"/>
+            </w:tcMar>
           </w:tcPr>
           <w:p>
             <w:pPr>
@@ -4638,7 +5587,7 @@
             <w:r>
               <w:rPr>
                 <w:rFonts w:ascii="Calibri" w:hAnsi="Calibri"/>
-                <w:sz w:val="22"/>
+                <w:sz w:val="28"/>
               </w:rPr>
               <w:t>☐</w:t>
             </w:r>
@@ -4647,6 +5596,12 @@
         <w:tc>
           <w:tcPr>
             <w:tcW w:type="dxa" w:w="567"/>
+            <w:tcMar>
+              <w:top w:w="100" w:type="dxa"/>
+              <w:bottom w:w="100" w:type="dxa"/>
+              <w:left w:w="120" w:type="dxa"/>
+              <w:right w:w="120" w:type="dxa"/>
+            </w:tcMar>
           </w:tcPr>
           <w:p>
             <w:pPr>
@@ -4655,7 +5610,7 @@
             <w:r>
               <w:rPr>
                 <w:rFonts w:ascii="Calibri" w:hAnsi="Calibri"/>
-                <w:sz w:val="22"/>
+                <w:sz w:val="28"/>
               </w:rPr>
               <w:t>☐</w:t>
             </w:r>
@@ -4664,6 +5619,12 @@
         <w:tc>
           <w:tcPr>
             <w:tcW w:type="dxa" w:w="680"/>
+            <w:tcMar>
+              <w:top w:w="100" w:type="dxa"/>
+              <w:bottom w:w="100" w:type="dxa"/>
+              <w:left w:w="120" w:type="dxa"/>
+              <w:right w:w="120" w:type="dxa"/>
+            </w:tcMar>
           </w:tcPr>
           <w:p>
             <w:pPr>
@@ -4672,7 +5633,7 @@
             <w:r>
               <w:rPr>
                 <w:rFonts w:ascii="Calibri" w:hAnsi="Calibri"/>
-                <w:sz w:val="22"/>
+                <w:sz w:val="28"/>
               </w:rPr>
               <w:t>☐</w:t>
             </w:r>
@@ -4683,6 +5644,12 @@
         <w:tc>
           <w:tcPr>
             <w:tcW w:type="dxa" w:w="510"/>
+            <w:tcMar>
+              <w:top w:w="100" w:type="dxa"/>
+              <w:bottom w:w="100" w:type="dxa"/>
+              <w:left w:w="120" w:type="dxa"/>
+              <w:right w:w="120" w:type="dxa"/>
+            </w:tcMar>
           </w:tcPr>
           <w:p>
             <w:pPr>
@@ -4691,7 +5658,8 @@
             <w:r>
               <w:rPr>
                 <w:rFonts w:ascii="Calibri" w:hAnsi="Calibri"/>
-                <w:sz w:val="18"/>
+                <w:b/>
+                <w:sz w:val="20"/>
               </w:rPr>
               <w:t>32</w:t>
             </w:r>
@@ -4700,13 +5668,19 @@
         <w:tc>
           <w:tcPr>
             <w:tcW w:type="dxa" w:w="7483"/>
+            <w:tcMar>
+              <w:top w:w="100" w:type="dxa"/>
+              <w:bottom w:w="100" w:type="dxa"/>
+              <w:left w:w="120" w:type="dxa"/>
+              <w:right w:w="120" w:type="dxa"/>
+            </w:tcMar>
           </w:tcPr>
           <w:p>
             <w:r>
               <w:rPr>
                 <w:rFonts w:ascii="Calibri" w:hAnsi="Calibri"/>
                 <w:color w:val="1A1F2C"/>
-                <w:sz w:val="18"/>
+                <w:sz w:val="20"/>
               </w:rPr>
               <w:t>Premises have been left in a tidy condition and all surplus materials and equipment removed from site.</w:t>
             </w:r>
@@ -4715,6 +5689,12 @@
         <w:tc>
           <w:tcPr>
             <w:tcW w:type="dxa" w:w="567"/>
+            <w:tcMar>
+              <w:top w:w="100" w:type="dxa"/>
+              <w:bottom w:w="100" w:type="dxa"/>
+              <w:left w:w="120" w:type="dxa"/>
+              <w:right w:w="120" w:type="dxa"/>
+            </w:tcMar>
           </w:tcPr>
           <w:p>
             <w:pPr>
@@ -4723,7 +5703,7 @@
             <w:r>
               <w:rPr>
                 <w:rFonts w:ascii="Calibri" w:hAnsi="Calibri"/>
-                <w:sz w:val="22"/>
+                <w:sz w:val="28"/>
               </w:rPr>
               <w:t>☐</w:t>
             </w:r>
@@ -4732,6 +5712,12 @@
         <w:tc>
           <w:tcPr>
             <w:tcW w:type="dxa" w:w="567"/>
+            <w:tcMar>
+              <w:top w:w="100" w:type="dxa"/>
+              <w:bottom w:w="100" w:type="dxa"/>
+              <w:left w:w="120" w:type="dxa"/>
+              <w:right w:w="120" w:type="dxa"/>
+            </w:tcMar>
           </w:tcPr>
           <w:p>
             <w:pPr>
@@ -4740,7 +5726,7 @@
             <w:r>
               <w:rPr>
                 <w:rFonts w:ascii="Calibri" w:hAnsi="Calibri"/>
-                <w:sz w:val="22"/>
+                <w:sz w:val="28"/>
               </w:rPr>
               <w:t>☐</w:t>
             </w:r>
@@ -4749,6 +5735,12 @@
         <w:tc>
           <w:tcPr>
             <w:tcW w:type="dxa" w:w="680"/>
+            <w:tcMar>
+              <w:top w:w="100" w:type="dxa"/>
+              <w:bottom w:w="100" w:type="dxa"/>
+              <w:left w:w="120" w:type="dxa"/>
+              <w:right w:w="120" w:type="dxa"/>
+            </w:tcMar>
           </w:tcPr>
           <w:p>
             <w:pPr>
@@ -4757,7 +5749,7 @@
             <w:r>
               <w:rPr>
                 <w:rFonts w:ascii="Calibri" w:hAnsi="Calibri"/>
-                <w:sz w:val="22"/>
+                <w:sz w:val="28"/>
               </w:rPr>
               <w:t>☐</w:t>
             </w:r>
@@ -4768,6 +5760,12 @@
         <w:tc>
           <w:tcPr>
             <w:tcW w:type="dxa" w:w="510"/>
+            <w:tcMar>
+              <w:top w:w="100" w:type="dxa"/>
+              <w:bottom w:w="100" w:type="dxa"/>
+              <w:left w:w="120" w:type="dxa"/>
+              <w:right w:w="120" w:type="dxa"/>
+            </w:tcMar>
           </w:tcPr>
           <w:p>
             <w:pPr>
@@ -4776,7 +5774,8 @@
             <w:r>
               <w:rPr>
                 <w:rFonts w:ascii="Calibri" w:hAnsi="Calibri"/>
-                <w:sz w:val="18"/>
+                <w:b/>
+                <w:sz w:val="20"/>
               </w:rPr>
               <w:t>33</w:t>
             </w:r>
@@ -4785,13 +5784,19 @@
         <w:tc>
           <w:tcPr>
             <w:tcW w:type="dxa" w:w="7483"/>
+            <w:tcMar>
+              <w:top w:w="100" w:type="dxa"/>
+              <w:bottom w:w="100" w:type="dxa"/>
+              <w:left w:w="120" w:type="dxa"/>
+              <w:right w:w="120" w:type="dxa"/>
+            </w:tcMar>
           </w:tcPr>
           <w:p>
             <w:r>
               <w:rPr>
                 <w:rFonts w:ascii="Calibri" w:hAnsi="Calibri"/>
                 <w:color w:val="1A1F2C"/>
-                <w:sz w:val="18"/>
+                <w:sz w:val="20"/>
               </w:rPr>
               <w:t>Signage — correct signage has been installed (call points and fire action signs).</w:t>
             </w:r>
@@ -4800,6 +5805,12 @@
         <w:tc>
           <w:tcPr>
             <w:tcW w:type="dxa" w:w="567"/>
+            <w:tcMar>
+              <w:top w:w="100" w:type="dxa"/>
+              <w:bottom w:w="100" w:type="dxa"/>
+              <w:left w:w="120" w:type="dxa"/>
+              <w:right w:w="120" w:type="dxa"/>
+            </w:tcMar>
           </w:tcPr>
           <w:p>
             <w:pPr>
@@ -4808,7 +5819,7 @@
             <w:r>
               <w:rPr>
                 <w:rFonts w:ascii="Calibri" w:hAnsi="Calibri"/>
-                <w:sz w:val="22"/>
+                <w:sz w:val="28"/>
               </w:rPr>
               <w:t>☐</w:t>
             </w:r>
@@ -4817,6 +5828,12 @@
         <w:tc>
           <w:tcPr>
             <w:tcW w:type="dxa" w:w="567"/>
+            <w:tcMar>
+              <w:top w:w="100" w:type="dxa"/>
+              <w:bottom w:w="100" w:type="dxa"/>
+              <w:left w:w="120" w:type="dxa"/>
+              <w:right w:w="120" w:type="dxa"/>
+            </w:tcMar>
           </w:tcPr>
           <w:p>
             <w:pPr>
@@ -4825,7 +5842,7 @@
             <w:r>
               <w:rPr>
                 <w:rFonts w:ascii="Calibri" w:hAnsi="Calibri"/>
-                <w:sz w:val="22"/>
+                <w:sz w:val="28"/>
               </w:rPr>
               <w:t>☐</w:t>
             </w:r>
@@ -4834,6 +5851,12 @@
         <w:tc>
           <w:tcPr>
             <w:tcW w:type="dxa" w:w="680"/>
+            <w:tcMar>
+              <w:top w:w="100" w:type="dxa"/>
+              <w:bottom w:w="100" w:type="dxa"/>
+              <w:left w:w="120" w:type="dxa"/>
+              <w:right w:w="120" w:type="dxa"/>
+            </w:tcMar>
           </w:tcPr>
           <w:p>
             <w:pPr>
@@ -4842,7 +5865,7 @@
             <w:r>
               <w:rPr>
                 <w:rFonts w:ascii="Calibri" w:hAnsi="Calibri"/>
-                <w:sz w:val="22"/>
+                <w:sz w:val="28"/>
               </w:rPr>
               <w:t>☐</w:t>
             </w:r>

</xml_diff>